<commit_message>
Update CV for Junior Frontend.
</commit_message>
<xml_diff>
--- a/CV.en.docx
+++ b/CV.en.docx
@@ -1,6 +1,6 @@
 
 <file path=word/document.xml><?xml version="1.0" encoding="utf-8"?>
-<w:document xmlns:wpc="http://schemas.microsoft.com/office/word/2010/wordprocessingCanvas" xmlns:cx="http://schemas.microsoft.com/office/drawing/2014/chartex" xmlns:mc="http://schemas.openxmlformats.org/markup-compatibility/2006" xmlns:o="urn:schemas-microsoft-com:office:office" xmlns:r="http://schemas.openxmlformats.org/officeDocument/2006/relationships" xmlns:m="http://schemas.openxmlformats.org/officeDocument/2006/math" xmlns:v="urn:schemas-microsoft-com:vml" xmlns:wp14="http://schemas.microsoft.com/office/word/2010/wordprocessingDrawing" xmlns:wp="http://schemas.openxmlformats.org/drawingml/2006/wordprocessingDrawing" xmlns:w10="urn:schemas-microsoft-com:office:word" xmlns:w="http://schemas.openxmlformats.org/wordprocessingml/2006/main" xmlns:w14="http://schemas.microsoft.com/office/word/2010/wordml" xmlns:w15="http://schemas.microsoft.com/office/word/2012/wordml" xmlns:w16se="http://schemas.microsoft.com/office/word/2015/wordml/symex" xmlns:wpg="http://schemas.microsoft.com/office/word/2010/wordprocessingGroup" xmlns:wpi="http://schemas.microsoft.com/office/word/2010/wordprocessingInk" xmlns:wne="http://schemas.microsoft.com/office/word/2006/wordml" xmlns:wps="http://schemas.microsoft.com/office/word/2010/wordprocessingShape" mc:Ignorable="w14 w15 w16se wp14">
+<w:document xmlns:wpc="http://schemas.microsoft.com/office/word/2010/wordprocessingCanvas" xmlns:cx="http://schemas.microsoft.com/office/drawing/2014/chartex" xmlns:cx1="http://schemas.microsoft.com/office/drawing/2015/9/8/chartex" xmlns:cx2="http://schemas.microsoft.com/office/drawing/2015/10/21/chartex" xmlns:cx3="http://schemas.microsoft.com/office/drawing/2016/5/9/chartex" xmlns:cx4="http://schemas.microsoft.com/office/drawing/2016/5/10/chartex" xmlns:cx5="http://schemas.microsoft.com/office/drawing/2016/5/11/chartex" xmlns:cx6="http://schemas.microsoft.com/office/drawing/2016/5/12/chartex" xmlns:cx7="http://schemas.microsoft.com/office/drawing/2016/5/13/chartex" xmlns:cx8="http://schemas.microsoft.com/office/drawing/2016/5/14/chartex" xmlns:mc="http://schemas.openxmlformats.org/markup-compatibility/2006" xmlns:aink="http://schemas.microsoft.com/office/drawing/2016/ink" xmlns:am3d="http://schemas.microsoft.com/office/drawing/2017/model3d" xmlns:o="urn:schemas-microsoft-com:office:office" xmlns:oel="http://schemas.microsoft.com/office/2019/extlst" xmlns:r="http://schemas.openxmlformats.org/officeDocument/2006/relationships" xmlns:m="http://schemas.openxmlformats.org/officeDocument/2006/math" xmlns:v="urn:schemas-microsoft-com:vml" xmlns:wp14="http://schemas.microsoft.com/office/word/2010/wordprocessingDrawing" xmlns:wp="http://schemas.openxmlformats.org/drawingml/2006/wordprocessingDrawing" xmlns:w10="urn:schemas-microsoft-com:office:word" xmlns:w="http://schemas.openxmlformats.org/wordprocessingml/2006/main" xmlns:w14="http://schemas.microsoft.com/office/word/2010/wordml" xmlns:w15="http://schemas.microsoft.com/office/word/2012/wordml" xmlns:w16cex="http://schemas.microsoft.com/office/word/2018/wordml/cex" xmlns:w16cid="http://schemas.microsoft.com/office/word/2016/wordml/cid" xmlns:w16="http://schemas.microsoft.com/office/word/2018/wordml" xmlns:w16du="http://schemas.microsoft.com/office/word/2023/wordml/word16du" xmlns:w16sdtdh="http://schemas.microsoft.com/office/word/2020/wordml/sdtdatahash" xmlns:w16sdtfl="http://schemas.microsoft.com/office/word/2024/wordml/sdtformatlock" xmlns:w16se="http://schemas.microsoft.com/office/word/2015/wordml/symex" xmlns:wpg="http://schemas.microsoft.com/office/word/2010/wordprocessingGroup" xmlns:wpi="http://schemas.microsoft.com/office/word/2010/wordprocessingInk" xmlns:wne="http://schemas.microsoft.com/office/word/2006/wordml" xmlns:wps="http://schemas.microsoft.com/office/word/2010/wordprocessingShape" mc:Ignorable="w14 w15 w16se w16cid w16 w16cex w16sdtdh w16sdtfl w16du wp14">
   <w:body>
     <w:p>
       <w:pPr>
@@ -135,7 +135,23 @@
           <w:sz w:val="24"/>
           <w:szCs w:val="24"/>
         </w:rPr>
-        <w:t xml:space="preserve">A graduate in Information Technology with 1 </w:t>
+        <w:t xml:space="preserve">A graduate in Information Technology with </w:t>
+      </w:r>
+      <w:r>
+        <w:rPr>
+          <w:rFonts w:ascii="Calibri" w:hAnsi="Calibri" w:cs="Calibri"/>
+          <w:sz w:val="24"/>
+          <w:szCs w:val="24"/>
+        </w:rPr>
+        <w:t xml:space="preserve">more </w:t>
+      </w:r>
+      <w:r>
+        <w:rPr>
+          <w:rFonts w:ascii="Calibri" w:hAnsi="Calibri" w:cs="Calibri"/>
+          <w:sz w:val="24"/>
+          <w:szCs w:val="24"/>
+        </w:rPr>
+        <w:t xml:space="preserve">1 </w:t>
       </w:r>
       <w:r>
         <w:rPr>
@@ -187,6 +203,35 @@
         <w:spacing w:line="240" w:lineRule="auto"/>
         <w:rPr>
           <w:rFonts w:ascii="Calibri" w:hAnsi="Calibri" w:cs="Calibri"/>
+          <w:bCs/>
+          <w:sz w:val="24"/>
+          <w:szCs w:val="24"/>
+        </w:rPr>
+      </w:pPr>
+      <w:r>
+        <w:rPr>
+          <w:rFonts w:ascii="Calibri" w:hAnsi="Calibri" w:cs="Calibri"/>
+          <w:b/>
+          <w:sz w:val="24"/>
+          <w:szCs w:val="24"/>
+        </w:rPr>
+        <w:t xml:space="preserve">Programming Languages: </w:t>
+      </w:r>
+      <w:r>
+        <w:rPr>
+          <w:rFonts w:ascii="Calibri" w:hAnsi="Calibri" w:cs="Calibri"/>
+          <w:bCs/>
+          <w:sz w:val="24"/>
+          <w:szCs w:val="24"/>
+        </w:rPr>
+        <w:t>Java 17 (Core, Stream API, Multithreading), SQL.</w:t>
+      </w:r>
+    </w:p>
+    <w:p>
+      <w:pPr>
+        <w:spacing w:line="240" w:lineRule="auto"/>
+        <w:rPr>
+          <w:rFonts w:ascii="Calibri" w:hAnsi="Calibri" w:cs="Calibri"/>
           <w:sz w:val="24"/>
           <w:szCs w:val="24"/>
         </w:rPr>
@@ -218,109 +263,199 @@
         </w:rPr>
         <w:t xml:space="preserve"> </w:t>
       </w:r>
-      <w:r>
-        <w:rPr>
-          <w:rFonts w:ascii="Calibri" w:hAnsi="Calibri" w:cs="Calibri"/>
-          <w:sz w:val="24"/>
-          <w:szCs w:val="24"/>
-        </w:rPr>
-        <w:t xml:space="preserve">Java 17, Java Core, Spring Boot, Spring MVC, </w:t>
-      </w:r>
-      <w:r>
-        <w:rPr>
-          <w:rFonts w:ascii="Calibri" w:hAnsi="Calibri" w:cs="Calibri"/>
-          <w:sz w:val="24"/>
-          <w:szCs w:val="24"/>
-        </w:rPr>
-        <w:t>Spring Validation, Spring AOP</w:t>
-      </w:r>
-      <w:r>
-        <w:rPr>
-          <w:rFonts w:ascii="Calibri" w:hAnsi="Calibri" w:cs="Calibri"/>
-          <w:sz w:val="24"/>
-          <w:szCs w:val="24"/>
-        </w:rPr>
-        <w:t xml:space="preserve">, </w:t>
-      </w:r>
-      <w:r>
-        <w:rPr>
-          <w:rFonts w:ascii="Calibri" w:hAnsi="Calibri" w:cs="Calibri"/>
-          <w:sz w:val="24"/>
-          <w:szCs w:val="24"/>
-        </w:rPr>
-        <w:t>Spring Security, Spring Data JPA</w:t>
-      </w:r>
-      <w:r>
-        <w:rPr>
-          <w:rFonts w:ascii="Calibri" w:hAnsi="Calibri" w:cs="Calibri"/>
-          <w:sz w:val="24"/>
-          <w:szCs w:val="24"/>
-        </w:rPr>
-        <w:t>/</w:t>
-      </w:r>
-      <w:r>
-        <w:rPr>
-          <w:rFonts w:ascii="Calibri" w:hAnsi="Calibri" w:cs="Calibri"/>
-          <w:sz w:val="24"/>
-          <w:szCs w:val="24"/>
-        </w:rPr>
-        <w:t>Hibernate,</w:t>
-      </w:r>
-      <w:r>
-        <w:rPr>
-          <w:rFonts w:ascii="Calibri" w:hAnsi="Calibri" w:cs="Calibri"/>
-          <w:sz w:val="24"/>
-          <w:szCs w:val="24"/>
-        </w:rPr>
-        <w:t xml:space="preserve"> </w:t>
-      </w:r>
-      <w:r>
-        <w:rPr>
-          <w:rFonts w:ascii="Calibri" w:hAnsi="Calibri" w:cs="Calibri"/>
-          <w:sz w:val="24"/>
-          <w:szCs w:val="24"/>
-        </w:rPr>
-        <w:t>Transaction Management</w:t>
-      </w:r>
-      <w:r>
-        <w:rPr>
-          <w:rFonts w:ascii="Calibri" w:hAnsi="Calibri" w:cs="Calibri"/>
-          <w:sz w:val="24"/>
-          <w:szCs w:val="24"/>
-        </w:rPr>
-        <w:t>,</w:t>
-      </w:r>
-      <w:r>
-        <w:rPr>
-          <w:rFonts w:ascii="Calibri" w:hAnsi="Calibri" w:cs="Calibri"/>
-          <w:sz w:val="24"/>
-          <w:szCs w:val="24"/>
-        </w:rPr>
-        <w:t xml:space="preserve"> Lombok, RESTful API, Message Broker </w:t>
-      </w:r>
-      <w:r>
-        <w:rPr>
-          <w:rFonts w:ascii="Calibri" w:hAnsi="Calibri" w:cs="Calibri"/>
-          <w:sz w:val="24"/>
-          <w:szCs w:val="24"/>
-        </w:rPr>
-        <w:t>(A</w:t>
-      </w:r>
-      <w:r>
-        <w:rPr>
-          <w:rFonts w:ascii="Calibri" w:hAnsi="Calibri" w:cs="Calibri"/>
-          <w:sz w:val="24"/>
-          <w:szCs w:val="24"/>
-        </w:rPr>
-        <w:t xml:space="preserve">ctiveMQ, RabbitMQ), Real-Time Data (WebSocket), Spring Batch, Spring Scheduler, Quartz Scheduler, </w:t>
-      </w:r>
-      <w:r>
-        <w:rPr>
-          <w:rFonts w:ascii="Calibri" w:hAnsi="Calibri" w:cs="Calibri"/>
-          <w:sz w:val="24"/>
-          <w:szCs w:val="24"/>
-        </w:rPr>
-        <w:t>MyBatis, Flyway</w:t>
+    </w:p>
+    <w:p>
+      <w:pPr>
+        <w:pStyle w:val="ListParagraph"/>
+        <w:numPr>
+          <w:ilvl w:val="0"/>
+          <w:numId w:val="1"/>
+        </w:numPr>
+        <w:spacing w:line="240" w:lineRule="auto"/>
+        <w:rPr>
+          <w:rFonts w:ascii="Calibri" w:hAnsi="Calibri" w:cs="Calibri"/>
+          <w:b/>
+          <w:sz w:val="24"/>
+          <w:szCs w:val="24"/>
+        </w:rPr>
+      </w:pPr>
+      <w:r>
+        <w:rPr>
+          <w:rFonts w:ascii="Calibri" w:hAnsi="Calibri" w:cs="Calibri"/>
+          <w:b/>
+          <w:sz w:val="24"/>
+          <w:szCs w:val="24"/>
+        </w:rPr>
+        <w:t xml:space="preserve">Frameworks: </w:t>
+      </w:r>
+      <w:r>
+        <w:rPr>
+          <w:rFonts w:ascii="Calibri" w:hAnsi="Calibri" w:cs="Calibri"/>
+          <w:bCs/>
+          <w:sz w:val="24"/>
+          <w:szCs w:val="24"/>
+        </w:rPr>
+        <w:t xml:space="preserve">Spring Boot 3, Spring MVC, Spring Security (JWT/OAuth2), Spring Data JPA/Hibernate, </w:t>
+      </w:r>
+      <w:proofErr w:type="spellStart"/>
+      <w:r>
+        <w:rPr>
+          <w:rFonts w:ascii="Calibri" w:hAnsi="Calibri" w:cs="Calibri"/>
+          <w:bCs/>
+          <w:sz w:val="24"/>
+          <w:szCs w:val="24"/>
+        </w:rPr>
+        <w:t>MyBatis</w:t>
+      </w:r>
+      <w:proofErr w:type="spellEnd"/>
+      <w:r>
+        <w:rPr>
+          <w:rFonts w:ascii="Calibri" w:hAnsi="Calibri" w:cs="Calibri"/>
+          <w:bCs/>
+          <w:sz w:val="24"/>
+          <w:szCs w:val="24"/>
+        </w:rPr>
+        <w:t>.</w:t>
+      </w:r>
+    </w:p>
+    <w:p>
+      <w:pPr>
+        <w:pStyle w:val="ListParagraph"/>
+        <w:numPr>
+          <w:ilvl w:val="0"/>
+          <w:numId w:val="1"/>
+        </w:numPr>
+        <w:spacing w:line="240" w:lineRule="auto"/>
+        <w:rPr>
+          <w:rFonts w:ascii="Calibri" w:hAnsi="Calibri" w:cs="Calibri"/>
+          <w:b/>
+          <w:sz w:val="24"/>
+          <w:szCs w:val="24"/>
+        </w:rPr>
+      </w:pPr>
+      <w:r>
+        <w:rPr>
+          <w:rFonts w:ascii="Calibri" w:hAnsi="Calibri" w:cs="Calibri"/>
+          <w:b/>
+          <w:sz w:val="24"/>
+          <w:szCs w:val="24"/>
+        </w:rPr>
+        <w:t xml:space="preserve">Advanced Features: </w:t>
+      </w:r>
+      <w:r>
+        <w:rPr>
+          <w:rFonts w:ascii="Calibri" w:hAnsi="Calibri" w:cs="Calibri"/>
+          <w:bCs/>
+          <w:sz w:val="24"/>
+          <w:szCs w:val="24"/>
+        </w:rPr>
+        <w:t>Spring AOP, Spring Batch, Spring Scheduler/Quartz, Transaction Management.</w:t>
+      </w:r>
+    </w:p>
+    <w:p>
+      <w:pPr>
+        <w:pStyle w:val="ListParagraph"/>
+        <w:numPr>
+          <w:ilvl w:val="0"/>
+          <w:numId w:val="1"/>
+        </w:numPr>
+        <w:spacing w:line="240" w:lineRule="auto"/>
+        <w:rPr>
+          <w:rFonts w:ascii="Calibri" w:hAnsi="Calibri" w:cs="Calibri"/>
+          <w:b/>
+          <w:sz w:val="24"/>
+          <w:szCs w:val="24"/>
+        </w:rPr>
+      </w:pPr>
+      <w:r>
+        <w:rPr>
+          <w:rFonts w:ascii="Calibri" w:hAnsi="Calibri" w:cs="Calibri"/>
+          <w:b/>
+          <w:sz w:val="24"/>
+          <w:szCs w:val="24"/>
+        </w:rPr>
+        <w:t xml:space="preserve">Real-time &amp; Messaging: </w:t>
+      </w:r>
+      <w:r>
+        <w:rPr>
+          <w:rFonts w:ascii="Calibri" w:hAnsi="Calibri" w:cs="Calibri"/>
+          <w:bCs/>
+          <w:sz w:val="24"/>
+          <w:szCs w:val="24"/>
+        </w:rPr>
+        <w:t>WebSocket (Stomp), Message Brokers (RabbitMQ, ActiveMQ</w:t>
+      </w:r>
+      <w:r>
+        <w:rPr>
+          <w:rFonts w:ascii="Calibri" w:hAnsi="Calibri" w:cs="Calibri"/>
+          <w:bCs/>
+          <w:sz w:val="24"/>
+          <w:szCs w:val="24"/>
+        </w:rPr>
+        <w:t>, Kafka</w:t>
+      </w:r>
+      <w:r>
+        <w:rPr>
+          <w:rFonts w:ascii="Calibri" w:hAnsi="Calibri" w:cs="Calibri"/>
+          <w:bCs/>
+          <w:sz w:val="24"/>
+          <w:szCs w:val="24"/>
+        </w:rPr>
+        <w:t>).</w:t>
+      </w:r>
+    </w:p>
+    <w:p>
+      <w:pPr>
+        <w:pStyle w:val="ListParagraph"/>
+        <w:numPr>
+          <w:ilvl w:val="0"/>
+          <w:numId w:val="1"/>
+        </w:numPr>
+        <w:spacing w:line="240" w:lineRule="auto"/>
+        <w:rPr>
+          <w:rFonts w:ascii="Calibri" w:hAnsi="Calibri" w:cs="Calibri"/>
+          <w:b/>
+          <w:sz w:val="24"/>
+          <w:szCs w:val="24"/>
+        </w:rPr>
+      </w:pPr>
+      <w:r>
+        <w:rPr>
+          <w:rFonts w:ascii="Calibri" w:hAnsi="Calibri" w:cs="Calibri"/>
+          <w:b/>
+          <w:sz w:val="24"/>
+          <w:szCs w:val="24"/>
+        </w:rPr>
+        <w:t xml:space="preserve">API Design: </w:t>
+      </w:r>
+      <w:r>
+        <w:rPr>
+          <w:rFonts w:ascii="Calibri" w:hAnsi="Calibri" w:cs="Calibri"/>
+          <w:bCs/>
+          <w:sz w:val="24"/>
+          <w:szCs w:val="24"/>
+        </w:rPr>
+        <w:t>RESTful API, Swagger/</w:t>
+      </w:r>
+      <w:proofErr w:type="spellStart"/>
+      <w:r>
+        <w:rPr>
+          <w:rFonts w:ascii="Calibri" w:hAnsi="Calibri" w:cs="Calibri"/>
+          <w:bCs/>
+          <w:sz w:val="24"/>
+          <w:szCs w:val="24"/>
+        </w:rPr>
+        <w:t>OpenAPI</w:t>
+      </w:r>
+      <w:proofErr w:type="spellEnd"/>
+      <w:r>
+        <w:rPr>
+          <w:rFonts w:ascii="Calibri" w:hAnsi="Calibri" w:cs="Calibri"/>
+          <w:bCs/>
+          <w:sz w:val="24"/>
+          <w:szCs w:val="24"/>
+        </w:rPr>
+        <w:t>, Spring Validation.</w:t>
       </w:r>
     </w:p>
     <w:p>
@@ -347,7 +482,15 @@
           <w:sz w:val="24"/>
           <w:szCs w:val="24"/>
         </w:rPr>
-        <w:t>HTML5, CSS3, JavaScript, jQuery, Bootstrap, Thymeleaf, JSON</w:t>
+        <w:t>ReactJS, TypeScript (Vite), HTML5, CSS3, JavaScript (ES6+), jQuery, Material UI</w:t>
+      </w:r>
+      <w:r>
+        <w:rPr>
+          <w:rFonts w:ascii="Calibri" w:hAnsi="Calibri" w:cs="Calibri"/>
+          <w:sz w:val="24"/>
+          <w:szCs w:val="24"/>
+        </w:rPr>
+        <w:t>, Tailwind CSS, Bootstrap.</w:t>
       </w:r>
     </w:p>
     <w:p>
@@ -374,7 +517,7 @@
           <w:sz w:val="24"/>
           <w:szCs w:val="24"/>
         </w:rPr>
-        <w:t>MySQL, MS SQL, Oracle, SQLite</w:t>
+        <w:t>Oracle DB, PostgreSQL, MySQL, MS SQL, Flyway (Migration).</w:t>
       </w:r>
     </w:p>
     <w:p>
@@ -409,15 +552,25 @@
           <w:sz w:val="24"/>
           <w:szCs w:val="24"/>
         </w:rPr>
-        <w:t>VCS (Git, GitH</w:t>
-      </w:r>
-      <w:r>
-        <w:rPr>
-          <w:rFonts w:ascii="Calibri" w:hAnsi="Calibri" w:cs="Calibri"/>
-          <w:sz w:val="24"/>
-          <w:szCs w:val="24"/>
-        </w:rPr>
-        <w:t>ub), Maven, Gradle, Docker, AWS, Linux, Postman, Swagger</w:t>
+        <w:t>Docker, AWS (</w:t>
+      </w:r>
+      <w:proofErr w:type="spellStart"/>
+      <w:r>
+        <w:rPr>
+          <w:rFonts w:ascii="Calibri" w:hAnsi="Calibri" w:cs="Calibri"/>
+          <w:sz w:val="24"/>
+          <w:szCs w:val="24"/>
+        </w:rPr>
+        <w:t>Lightsail</w:t>
+      </w:r>
+      <w:proofErr w:type="spellEnd"/>
+      <w:r>
+        <w:rPr>
+          <w:rFonts w:ascii="Calibri" w:hAnsi="Calibri" w:cs="Calibri"/>
+          <w:sz w:val="24"/>
+          <w:szCs w:val="24"/>
+        </w:rPr>
+        <w:t>), Linux, Maven, Gradle, Git/GitHub, Postman.</w:t>
       </w:r>
     </w:p>
     <w:p>
@@ -446,16 +599,33 @@
         </w:rPr>
         <w:t>: JUnit 5, Mockito, Spring Test</w:t>
       </w:r>
-    </w:p>
-    <w:p>
-      <w:pPr>
-        <w:spacing w:line="240" w:lineRule="auto"/>
-        <w:rPr>
-          <w:rFonts w:ascii="Calibri" w:hAnsi="Calibri" w:cs="Calibri"/>
-          <w:sz w:val="24"/>
-          <w:szCs w:val="24"/>
-        </w:rPr>
-      </w:pPr>
+      <w:r>
+        <w:rPr>
+          <w:rFonts w:ascii="Calibri" w:hAnsi="Calibri" w:cs="Calibri"/>
+          <w:sz w:val="24"/>
+          <w:szCs w:val="24"/>
+        </w:rPr>
+        <w:t>, SonarQube.</w:t>
+      </w:r>
+    </w:p>
+    <w:p>
+      <w:pPr>
+        <w:spacing w:line="240" w:lineRule="auto"/>
+        <w:rPr>
+          <w:rFonts w:ascii="Calibri" w:hAnsi="Calibri" w:cs="Calibri"/>
+          <w:sz w:val="24"/>
+          <w:szCs w:val="24"/>
+        </w:rPr>
+      </w:pPr>
+      <w:r>
+        <w:rPr>
+          <w:rFonts w:ascii="Calibri" w:hAnsi="Calibri" w:cs="Calibri"/>
+          <w:b/>
+          <w:sz w:val="24"/>
+          <w:szCs w:val="24"/>
+        </w:rPr>
+        <w:t xml:space="preserve">Soft Skills &amp; </w:t>
+      </w:r>
       <w:r>
         <w:rPr>
           <w:rFonts w:ascii="Calibri" w:hAnsi="Calibri" w:cs="Calibri"/>
@@ -471,7 +641,15 @@
           <w:sz w:val="24"/>
           <w:szCs w:val="24"/>
         </w:rPr>
-        <w:t>: OOP, Design Patterns, Unit &amp; Integration Testing, Agile/Scrum</w:t>
+        <w:t xml:space="preserve">: OOP, </w:t>
+      </w:r>
+      <w:r>
+        <w:rPr>
+          <w:rFonts w:ascii="Calibri" w:hAnsi="Calibri" w:cs="Calibri"/>
+          <w:sz w:val="24"/>
+          <w:szCs w:val="24"/>
+        </w:rPr>
+        <w:t>SOLID Principles, Design Patterns, Agile/Scrum, Unit &amp; Integration Testing, System Design.</w:t>
       </w:r>
     </w:p>
     <w:p>
@@ -503,6 +681,7 @@
           <w:szCs w:val="24"/>
         </w:rPr>
       </w:pPr>
+      <w:proofErr w:type="spellStart"/>
       <w:r>
         <w:rPr>
           <w:rFonts w:ascii="Calibri" w:hAnsi="Calibri" w:cs="Calibri"/>
@@ -512,6 +691,7 @@
         </w:rPr>
         <w:t>Bitsco</w:t>
       </w:r>
+      <w:proofErr w:type="spellEnd"/>
       <w:r>
         <w:rPr>
           <w:rFonts w:ascii="Calibri" w:hAnsi="Calibri" w:cs="Calibri"/>
@@ -528,7 +708,17 @@
           <w:sz w:val="24"/>
           <w:szCs w:val="24"/>
         </w:rPr>
-        <w:t xml:space="preserve"> (Vietnam) </w:t>
+        <w:t xml:space="preserve"> (</w:t>
+      </w:r>
+      <w:proofErr w:type="gramStart"/>
+      <w:r>
+        <w:rPr>
+          <w:rFonts w:ascii="Calibri" w:hAnsi="Calibri" w:cs="Calibri"/>
+          <w:b/>
+          <w:sz w:val="24"/>
+          <w:szCs w:val="24"/>
+        </w:rPr>
+        <w:t xml:space="preserve">Vietnam) </w:t>
       </w:r>
       <w:r>
         <w:rPr>
@@ -548,6 +738,7 @@
         </w:rPr>
         <w:tab/>
       </w:r>
+      <w:proofErr w:type="gramEnd"/>
       <w:r>
         <w:rPr>
           <w:rFonts w:ascii="Calibri" w:hAnsi="Calibri" w:cs="Calibri"/>
@@ -1063,6 +1254,7 @@
           <w:sz w:val="24"/>
           <w:szCs w:val="24"/>
         </w:rPr>
+        <w:lastRenderedPageBreak/>
         <w:t>Performed testing in the staging environment, fixed bugs, and prepared user documentation for staff.</w:t>
       </w:r>
     </w:p>
@@ -1090,23 +1282,7 @@
           <w:sz w:val="24"/>
           <w:szCs w:val="24"/>
         </w:rPr>
-        <w:t xml:space="preserve">: </w:t>
-      </w:r>
-      <w:r>
-        <w:rPr>
-          <w:rFonts w:ascii="Calibri" w:hAnsi="Calibri" w:cs="Calibri"/>
-          <w:sz w:val="24"/>
-          <w:szCs w:val="24"/>
-        </w:rPr>
-        <w:t>Digital Transformation Platform</w:t>
-      </w:r>
-      <w:r>
-        <w:rPr>
-          <w:rFonts w:ascii="Calibri" w:hAnsi="Calibri" w:cs="Calibri"/>
-          <w:sz w:val="24"/>
-          <w:szCs w:val="24"/>
-        </w:rPr>
-        <w:t xml:space="preserve">                     </w:t>
+        <w:t xml:space="preserve">: Digital Transformation Platform                     </w:t>
       </w:r>
       <w:r>
         <w:rPr>
@@ -1223,23 +1399,7 @@
           <w:sz w:val="24"/>
           <w:szCs w:val="24"/>
         </w:rPr>
-        <w:t xml:space="preserve">Spring Boot, </w:t>
-      </w:r>
-      <w:r>
-        <w:rPr>
-          <w:rFonts w:ascii="Calibri" w:hAnsi="Calibri" w:cs="Calibri"/>
-          <w:sz w:val="24"/>
-          <w:szCs w:val="24"/>
-        </w:rPr>
-        <w:t xml:space="preserve">Spring Security, </w:t>
-      </w:r>
-      <w:r>
-        <w:rPr>
-          <w:rFonts w:ascii="Calibri" w:hAnsi="Calibri" w:cs="Calibri"/>
-          <w:sz w:val="24"/>
-          <w:szCs w:val="24"/>
-        </w:rPr>
-        <w:t>JPA, RESTful API, Maven, Lombok</w:t>
+        <w:t>Spring Boot, Spring Security, JPA, RESTful API, Maven, Lombok</w:t>
       </w:r>
     </w:p>
     <w:p>
@@ -1264,7 +1424,6 @@
           <w:sz w:val="24"/>
           <w:szCs w:val="24"/>
         </w:rPr>
-        <w:lastRenderedPageBreak/>
         <w:t>Front-end:</w:t>
       </w:r>
       <w:r>
@@ -1274,34 +1433,7 @@
           <w:sz w:val="24"/>
           <w:szCs w:val="24"/>
         </w:rPr>
-        <w:t xml:space="preserve"> </w:t>
-      </w:r>
-      <w:r>
-        <w:rPr>
-          <w:rFonts w:ascii="Calibri" w:hAnsi="Calibri" w:cs="Calibri"/>
-          <w:bCs/>
-          <w:sz w:val="24"/>
-          <w:szCs w:val="24"/>
-        </w:rPr>
-        <w:t xml:space="preserve">ReactJS, </w:t>
-      </w:r>
-      <w:r>
-        <w:rPr>
-          <w:rFonts w:ascii="Calibri" w:hAnsi="Calibri" w:cs="Calibri"/>
-          <w:bCs/>
-          <w:sz w:val="24"/>
-          <w:szCs w:val="24"/>
-        </w:rPr>
-        <w:t>HTML5, CSS3</w:t>
-      </w:r>
-      <w:r>
-        <w:rPr>
-          <w:rFonts w:ascii="Calibri" w:hAnsi="Calibri" w:cs="Calibri"/>
-          <w:bCs/>
-          <w:sz w:val="24"/>
-          <w:szCs w:val="24"/>
-        </w:rPr>
-        <w:t>, Bootstrap</w:t>
+        <w:t xml:space="preserve"> ReactJS, HTML5, CSS3, Bootstrap</w:t>
       </w:r>
     </w:p>
     <w:p>
@@ -1485,6 +1617,1256 @@
           <w:szCs w:val="24"/>
         </w:rPr>
         <w:t>Created technical documentation and user guides for staff.</w:t>
+      </w:r>
+    </w:p>
+    <w:p>
+      <w:pPr>
+        <w:spacing w:line="240" w:lineRule="auto"/>
+        <w:rPr>
+          <w:rFonts w:ascii="Calibri" w:hAnsi="Calibri" w:cs="Calibri"/>
+          <w:sz w:val="24"/>
+          <w:szCs w:val="24"/>
+        </w:rPr>
+      </w:pPr>
+      <w:r>
+        <w:rPr>
+          <w:rFonts w:ascii="Calibri" w:hAnsi="Calibri" w:cs="Calibri"/>
+          <w:b/>
+          <w:sz w:val="24"/>
+          <w:szCs w:val="24"/>
+        </w:rPr>
+        <w:t>LG CNS</w:t>
+      </w:r>
+      <w:r>
+        <w:rPr>
+          <w:rFonts w:ascii="Calibri" w:hAnsi="Calibri" w:cs="Calibri"/>
+          <w:b/>
+          <w:sz w:val="24"/>
+          <w:szCs w:val="24"/>
+        </w:rPr>
+        <w:t xml:space="preserve"> Company (</w:t>
+      </w:r>
+      <w:proofErr w:type="gramStart"/>
+      <w:r>
+        <w:rPr>
+          <w:rFonts w:ascii="Calibri" w:hAnsi="Calibri" w:cs="Calibri"/>
+          <w:b/>
+          <w:sz w:val="24"/>
+          <w:szCs w:val="24"/>
+        </w:rPr>
+        <w:t xml:space="preserve">Vietnam)  </w:t>
+      </w:r>
+      <w:r>
+        <w:rPr>
+          <w:rFonts w:ascii="Calibri" w:hAnsi="Calibri" w:cs="Calibri"/>
+          <w:b/>
+          <w:sz w:val="24"/>
+          <w:szCs w:val="24"/>
+        </w:rPr>
+        <w:tab/>
+      </w:r>
+      <w:proofErr w:type="gramEnd"/>
+      <w:r>
+        <w:rPr>
+          <w:rFonts w:ascii="Calibri" w:hAnsi="Calibri" w:cs="Calibri"/>
+          <w:b/>
+          <w:sz w:val="24"/>
+          <w:szCs w:val="24"/>
+        </w:rPr>
+        <w:tab/>
+      </w:r>
+      <w:r>
+        <w:rPr>
+          <w:rFonts w:ascii="Calibri" w:hAnsi="Calibri" w:cs="Calibri"/>
+          <w:sz w:val="24"/>
+          <w:szCs w:val="24"/>
+        </w:rPr>
+        <w:t xml:space="preserve">   </w:t>
+      </w:r>
+      <w:r>
+        <w:rPr>
+          <w:rFonts w:ascii="Calibri" w:hAnsi="Calibri" w:cs="Calibri"/>
+          <w:b/>
+          <w:sz w:val="24"/>
+          <w:szCs w:val="24"/>
+        </w:rPr>
+        <w:t xml:space="preserve">          </w:t>
+      </w:r>
+      <w:r>
+        <w:rPr>
+          <w:rFonts w:ascii="Calibri" w:hAnsi="Calibri" w:cs="Calibri"/>
+          <w:sz w:val="24"/>
+          <w:szCs w:val="24"/>
+        </w:rPr>
+        <w:t xml:space="preserve">          </w:t>
+      </w:r>
+      <w:r>
+        <w:rPr>
+          <w:rFonts w:ascii="Calibri" w:hAnsi="Calibri" w:cs="Calibri"/>
+          <w:sz w:val="24"/>
+          <w:szCs w:val="24"/>
+        </w:rPr>
+        <w:tab/>
+      </w:r>
+      <w:r>
+        <w:rPr>
+          <w:rFonts w:ascii="Calibri" w:hAnsi="Calibri" w:cs="Calibri"/>
+          <w:sz w:val="24"/>
+          <w:szCs w:val="24"/>
+        </w:rPr>
+        <w:tab/>
+        <w:t xml:space="preserve">                            </w:t>
+      </w:r>
+      <w:r>
+        <w:rPr>
+          <w:rFonts w:ascii="Calibri" w:hAnsi="Calibri" w:cs="Calibri"/>
+          <w:b/>
+          <w:sz w:val="24"/>
+          <w:szCs w:val="24"/>
+        </w:rPr>
+        <w:t>0</w:t>
+      </w:r>
+      <w:r>
+        <w:rPr>
+          <w:rFonts w:ascii="Calibri" w:hAnsi="Calibri" w:cs="Calibri"/>
+          <w:b/>
+          <w:sz w:val="24"/>
+          <w:szCs w:val="24"/>
+        </w:rPr>
+        <w:t>2</w:t>
+      </w:r>
+      <w:r>
+        <w:rPr>
+          <w:rFonts w:ascii="Calibri" w:hAnsi="Calibri" w:cs="Calibri"/>
+          <w:b/>
+          <w:sz w:val="24"/>
+          <w:szCs w:val="24"/>
+        </w:rPr>
+        <w:t>/202</w:t>
+      </w:r>
+      <w:r>
+        <w:rPr>
+          <w:rFonts w:ascii="Calibri" w:hAnsi="Calibri" w:cs="Calibri"/>
+          <w:b/>
+          <w:sz w:val="24"/>
+          <w:szCs w:val="24"/>
+        </w:rPr>
+        <w:t>5</w:t>
+      </w:r>
+      <w:r>
+        <w:rPr>
+          <w:rFonts w:ascii="Calibri" w:hAnsi="Calibri" w:cs="Calibri"/>
+          <w:b/>
+          <w:sz w:val="24"/>
+          <w:szCs w:val="24"/>
+        </w:rPr>
+        <w:t>-</w:t>
+      </w:r>
+      <w:r>
+        <w:rPr>
+          <w:rFonts w:ascii="Calibri" w:hAnsi="Calibri" w:cs="Calibri"/>
+          <w:b/>
+          <w:sz w:val="24"/>
+          <w:szCs w:val="24"/>
+        </w:rPr>
+        <w:t>02</w:t>
+      </w:r>
+      <w:r>
+        <w:rPr>
+          <w:rFonts w:ascii="Calibri" w:hAnsi="Calibri" w:cs="Calibri"/>
+          <w:b/>
+          <w:sz w:val="24"/>
+          <w:szCs w:val="24"/>
+        </w:rPr>
+        <w:t>/202</w:t>
+      </w:r>
+      <w:r>
+        <w:rPr>
+          <w:rFonts w:ascii="Calibri" w:hAnsi="Calibri" w:cs="Calibri"/>
+          <w:b/>
+          <w:sz w:val="24"/>
+          <w:szCs w:val="24"/>
+        </w:rPr>
+        <w:t>6</w:t>
+      </w:r>
+    </w:p>
+    <w:p>
+      <w:pPr>
+        <w:spacing w:line="240" w:lineRule="auto"/>
+        <w:rPr>
+          <w:rFonts w:ascii="Calibri" w:hAnsi="Calibri" w:cs="Calibri"/>
+          <w:sz w:val="24"/>
+          <w:szCs w:val="24"/>
+        </w:rPr>
+      </w:pPr>
+      <w:r>
+        <w:rPr>
+          <w:rFonts w:ascii="Calibri" w:hAnsi="Calibri" w:cs="Calibri"/>
+          <w:b/>
+          <w:sz w:val="24"/>
+          <w:szCs w:val="24"/>
+        </w:rPr>
+        <w:t>Project</w:t>
+      </w:r>
+      <w:r>
+        <w:rPr>
+          <w:rFonts w:ascii="Calibri" w:hAnsi="Calibri" w:cs="Calibri"/>
+          <w:sz w:val="24"/>
+          <w:szCs w:val="24"/>
+        </w:rPr>
+        <w:t xml:space="preserve">: </w:t>
+      </w:r>
+      <w:proofErr w:type="spellStart"/>
+      <w:r>
+        <w:rPr>
+          <w:rFonts w:ascii="Calibri" w:hAnsi="Calibri" w:cs="Calibri"/>
+          <w:sz w:val="24"/>
+          <w:szCs w:val="24"/>
+        </w:rPr>
+        <w:t>BookingSeat</w:t>
+      </w:r>
+      <w:proofErr w:type="spellEnd"/>
+      <w:r>
+        <w:rPr>
+          <w:rFonts w:ascii="Calibri" w:hAnsi="Calibri" w:cs="Calibri"/>
+          <w:sz w:val="24"/>
+          <w:szCs w:val="24"/>
+        </w:rPr>
+        <w:t xml:space="preserve"> System</w:t>
+      </w:r>
+    </w:p>
+    <w:p>
+      <w:pPr>
+        <w:pStyle w:val="ListParagraph"/>
+        <w:numPr>
+          <w:ilvl w:val="0"/>
+          <w:numId w:val="1"/>
+        </w:numPr>
+        <w:spacing w:line="240" w:lineRule="auto"/>
+        <w:rPr>
+          <w:rFonts w:ascii="Calibri" w:hAnsi="Calibri" w:cs="Calibri"/>
+          <w:b/>
+          <w:sz w:val="24"/>
+          <w:szCs w:val="24"/>
+        </w:rPr>
+      </w:pPr>
+      <w:r>
+        <w:rPr>
+          <w:rFonts w:ascii="Calibri" w:hAnsi="Calibri" w:cs="Calibri"/>
+          <w:b/>
+          <w:sz w:val="24"/>
+          <w:szCs w:val="24"/>
+        </w:rPr>
+        <w:t xml:space="preserve">Description: </w:t>
+      </w:r>
+      <w:r>
+        <w:rPr>
+          <w:rFonts w:ascii="Calibri" w:hAnsi="Calibri" w:cs="Calibri"/>
+          <w:sz w:val="24"/>
+          <w:szCs w:val="24"/>
+        </w:rPr>
+        <w:t>A high-concurrency seat reservation system featuring real-time updates and automated task scheduling for optimized booking flows.</w:t>
+      </w:r>
+    </w:p>
+    <w:p>
+      <w:pPr>
+        <w:pStyle w:val="ListParagraph"/>
+        <w:numPr>
+          <w:ilvl w:val="0"/>
+          <w:numId w:val="1"/>
+        </w:numPr>
+        <w:spacing w:line="240" w:lineRule="auto"/>
+        <w:rPr>
+          <w:rFonts w:ascii="Calibri" w:hAnsi="Calibri" w:cs="Calibri"/>
+          <w:b/>
+          <w:sz w:val="24"/>
+          <w:szCs w:val="24"/>
+        </w:rPr>
+      </w:pPr>
+      <w:r>
+        <w:rPr>
+          <w:rFonts w:ascii="Calibri" w:hAnsi="Calibri" w:cs="Calibri"/>
+          <w:b/>
+          <w:sz w:val="24"/>
+          <w:szCs w:val="24"/>
+        </w:rPr>
+        <w:t>Technologies:</w:t>
+      </w:r>
+    </w:p>
+    <w:p>
+      <w:pPr>
+        <w:pStyle w:val="ListParagraph"/>
+        <w:numPr>
+          <w:ilvl w:val="0"/>
+          <w:numId w:val="2"/>
+        </w:numPr>
+        <w:spacing w:line="240" w:lineRule="auto"/>
+        <w:rPr>
+          <w:rFonts w:ascii="Calibri" w:hAnsi="Calibri" w:cs="Calibri"/>
+          <w:b/>
+          <w:sz w:val="24"/>
+          <w:szCs w:val="24"/>
+        </w:rPr>
+      </w:pPr>
+      <w:r>
+        <w:rPr>
+          <w:rFonts w:ascii="Calibri" w:hAnsi="Calibri" w:cs="Calibri"/>
+          <w:b/>
+          <w:sz w:val="24"/>
+          <w:szCs w:val="24"/>
+        </w:rPr>
+        <w:t xml:space="preserve">Back-end: </w:t>
+      </w:r>
+      <w:proofErr w:type="spellStart"/>
+      <w:r>
+        <w:rPr>
+          <w:rFonts w:ascii="Calibri" w:hAnsi="Calibri" w:cs="Calibri"/>
+          <w:sz w:val="24"/>
+          <w:szCs w:val="24"/>
+        </w:rPr>
+        <w:t>SpringBoot</w:t>
+      </w:r>
+      <w:proofErr w:type="spellEnd"/>
+      <w:r>
+        <w:rPr>
+          <w:rFonts w:ascii="Calibri" w:hAnsi="Calibri" w:cs="Calibri"/>
+          <w:sz w:val="24"/>
+          <w:szCs w:val="24"/>
+        </w:rPr>
+        <w:t>,</w:t>
+      </w:r>
+      <w:r>
+        <w:rPr>
+          <w:rFonts w:ascii="Calibri" w:hAnsi="Calibri" w:cs="Calibri"/>
+          <w:sz w:val="24"/>
+          <w:szCs w:val="24"/>
+        </w:rPr>
+        <w:t xml:space="preserve"> WebSocket, Spring</w:t>
+      </w:r>
+      <w:r>
+        <w:rPr>
+          <w:rFonts w:ascii="Calibri" w:hAnsi="Calibri" w:cs="Calibri"/>
+          <w:sz w:val="24"/>
+          <w:szCs w:val="24"/>
+        </w:rPr>
+        <w:t xml:space="preserve"> </w:t>
+      </w:r>
+      <w:r>
+        <w:rPr>
+          <w:rFonts w:ascii="Calibri" w:hAnsi="Calibri" w:cs="Calibri"/>
+          <w:sz w:val="24"/>
+          <w:szCs w:val="24"/>
+        </w:rPr>
+        <w:t xml:space="preserve">Schedule, </w:t>
+      </w:r>
+      <w:proofErr w:type="spellStart"/>
+      <w:r>
+        <w:rPr>
+          <w:rFonts w:ascii="Calibri" w:hAnsi="Calibri" w:cs="Calibri"/>
+          <w:sz w:val="24"/>
+          <w:szCs w:val="24"/>
+        </w:rPr>
+        <w:t>MyBatis</w:t>
+      </w:r>
+      <w:proofErr w:type="spellEnd"/>
+      <w:r>
+        <w:rPr>
+          <w:rFonts w:ascii="Calibri" w:hAnsi="Calibri" w:cs="Calibri"/>
+          <w:sz w:val="24"/>
+          <w:szCs w:val="24"/>
+        </w:rPr>
+        <w:t>, Spring Security</w:t>
+      </w:r>
+      <w:r>
+        <w:rPr>
+          <w:rFonts w:ascii="Calibri" w:hAnsi="Calibri" w:cs="Calibri"/>
+          <w:sz w:val="24"/>
+          <w:szCs w:val="24"/>
+        </w:rPr>
+        <w:t>.</w:t>
+      </w:r>
+    </w:p>
+    <w:p>
+      <w:pPr>
+        <w:pStyle w:val="ListParagraph"/>
+        <w:numPr>
+          <w:ilvl w:val="0"/>
+          <w:numId w:val="2"/>
+        </w:numPr>
+        <w:spacing w:line="240" w:lineRule="auto"/>
+        <w:rPr>
+          <w:rFonts w:ascii="Calibri" w:hAnsi="Calibri" w:cs="Calibri"/>
+          <w:b/>
+          <w:sz w:val="24"/>
+          <w:szCs w:val="24"/>
+        </w:rPr>
+      </w:pPr>
+      <w:r>
+        <w:rPr>
+          <w:rFonts w:ascii="Calibri" w:hAnsi="Calibri" w:cs="Calibri"/>
+          <w:b/>
+          <w:sz w:val="24"/>
+          <w:szCs w:val="24"/>
+        </w:rPr>
+        <w:t>Front-end:</w:t>
+      </w:r>
+      <w:r>
+        <w:rPr>
+          <w:rFonts w:ascii="Calibri" w:hAnsi="Calibri" w:cs="Calibri"/>
+          <w:bCs/>
+          <w:sz w:val="24"/>
+          <w:szCs w:val="24"/>
+        </w:rPr>
+        <w:t xml:space="preserve"> </w:t>
+      </w:r>
+      <w:r>
+        <w:rPr>
+          <w:rFonts w:ascii="Calibri" w:hAnsi="Calibri" w:cs="Calibri"/>
+          <w:bCs/>
+          <w:sz w:val="24"/>
+          <w:szCs w:val="24"/>
+        </w:rPr>
+        <w:t xml:space="preserve">Vue.js, </w:t>
+      </w:r>
+      <w:proofErr w:type="spellStart"/>
+      <w:r>
+        <w:rPr>
+          <w:rFonts w:ascii="Calibri" w:hAnsi="Calibri" w:cs="Calibri"/>
+          <w:bCs/>
+          <w:sz w:val="24"/>
+          <w:szCs w:val="24"/>
+        </w:rPr>
+        <w:t>Vuex</w:t>
+      </w:r>
+      <w:proofErr w:type="spellEnd"/>
+      <w:r>
+        <w:rPr>
+          <w:rFonts w:ascii="Calibri" w:hAnsi="Calibri" w:cs="Calibri"/>
+          <w:bCs/>
+          <w:sz w:val="24"/>
+          <w:szCs w:val="24"/>
+        </w:rPr>
+        <w:t>, Axios.</w:t>
+      </w:r>
+    </w:p>
+    <w:p>
+      <w:pPr>
+        <w:pStyle w:val="ListParagraph"/>
+        <w:numPr>
+          <w:ilvl w:val="0"/>
+          <w:numId w:val="2"/>
+        </w:numPr>
+        <w:spacing w:line="240" w:lineRule="auto"/>
+        <w:rPr>
+          <w:rFonts w:ascii="Calibri" w:hAnsi="Calibri" w:cs="Calibri"/>
+          <w:b/>
+          <w:sz w:val="24"/>
+          <w:szCs w:val="24"/>
+        </w:rPr>
+      </w:pPr>
+      <w:r>
+        <w:rPr>
+          <w:rFonts w:ascii="Calibri" w:hAnsi="Calibri" w:cs="Calibri"/>
+          <w:b/>
+          <w:sz w:val="24"/>
+          <w:szCs w:val="24"/>
+        </w:rPr>
+        <w:t xml:space="preserve">Database: </w:t>
+      </w:r>
+      <w:r>
+        <w:rPr>
+          <w:rFonts w:ascii="Calibri" w:hAnsi="Calibri" w:cs="Calibri"/>
+          <w:bCs/>
+          <w:sz w:val="24"/>
+          <w:szCs w:val="24"/>
+        </w:rPr>
+        <w:t>PostgreSQL</w:t>
+      </w:r>
+      <w:r>
+        <w:rPr>
+          <w:rFonts w:ascii="Calibri" w:hAnsi="Calibri" w:cs="Calibri"/>
+          <w:bCs/>
+          <w:sz w:val="24"/>
+          <w:szCs w:val="24"/>
+        </w:rPr>
+        <w:t>.</w:t>
+      </w:r>
+    </w:p>
+    <w:p>
+      <w:pPr>
+        <w:pStyle w:val="ListParagraph"/>
+        <w:numPr>
+          <w:ilvl w:val="0"/>
+          <w:numId w:val="2"/>
+        </w:numPr>
+        <w:spacing w:line="240" w:lineRule="auto"/>
+        <w:rPr>
+          <w:rFonts w:ascii="Calibri" w:hAnsi="Calibri" w:cs="Calibri"/>
+          <w:b/>
+          <w:sz w:val="24"/>
+          <w:szCs w:val="24"/>
+        </w:rPr>
+      </w:pPr>
+      <w:r>
+        <w:rPr>
+          <w:rFonts w:ascii="Calibri" w:hAnsi="Calibri" w:cs="Calibri"/>
+          <w:b/>
+          <w:sz w:val="24"/>
+          <w:szCs w:val="24"/>
+        </w:rPr>
+        <w:t xml:space="preserve">DevOps: </w:t>
+      </w:r>
+      <w:r>
+        <w:rPr>
+          <w:rFonts w:ascii="Calibri" w:hAnsi="Calibri" w:cs="Calibri"/>
+          <w:sz w:val="24"/>
+          <w:szCs w:val="24"/>
+        </w:rPr>
+        <w:t>Docker,</w:t>
+      </w:r>
+      <w:r>
+        <w:rPr>
+          <w:rFonts w:ascii="Calibri" w:hAnsi="Calibri" w:cs="Calibri"/>
+          <w:sz w:val="24"/>
+          <w:szCs w:val="24"/>
+        </w:rPr>
+        <w:t xml:space="preserve"> Git, GitHub</w:t>
+      </w:r>
+      <w:r>
+        <w:rPr>
+          <w:rFonts w:ascii="Calibri" w:hAnsi="Calibri" w:cs="Calibri"/>
+          <w:sz w:val="24"/>
+          <w:szCs w:val="24"/>
+        </w:rPr>
+        <w:t>.</w:t>
+      </w:r>
+    </w:p>
+    <w:p>
+      <w:pPr>
+        <w:pStyle w:val="ListParagraph"/>
+        <w:numPr>
+          <w:ilvl w:val="0"/>
+          <w:numId w:val="1"/>
+        </w:numPr>
+        <w:spacing w:line="240" w:lineRule="auto"/>
+        <w:rPr>
+          <w:rFonts w:ascii="Calibri" w:hAnsi="Calibri" w:cs="Calibri"/>
+          <w:b/>
+          <w:sz w:val="24"/>
+          <w:szCs w:val="24"/>
+        </w:rPr>
+      </w:pPr>
+      <w:r>
+        <w:rPr>
+          <w:rFonts w:ascii="Calibri" w:hAnsi="Calibri" w:cs="Calibri"/>
+          <w:b/>
+          <w:sz w:val="24"/>
+          <w:szCs w:val="24"/>
+        </w:rPr>
+        <w:t>Responsibilities:</w:t>
+      </w:r>
+    </w:p>
+    <w:p>
+      <w:pPr>
+        <w:pStyle w:val="ListParagraph"/>
+        <w:numPr>
+          <w:ilvl w:val="1"/>
+          <w:numId w:val="4"/>
+        </w:numPr>
+        <w:spacing w:line="240" w:lineRule="auto"/>
+        <w:rPr>
+          <w:rFonts w:ascii="Calibri" w:hAnsi="Calibri" w:cs="Calibri"/>
+          <w:sz w:val="24"/>
+          <w:szCs w:val="24"/>
+        </w:rPr>
+      </w:pPr>
+      <w:r>
+        <w:rPr>
+          <w:rFonts w:ascii="Calibri" w:hAnsi="Calibri" w:cs="Calibri"/>
+          <w:sz w:val="24"/>
+          <w:szCs w:val="24"/>
+        </w:rPr>
+        <w:t>Designed and implemented core RESTful APIs using Spring Boot to manage seat availability and booking transactions.</w:t>
+      </w:r>
+    </w:p>
+    <w:p>
+      <w:pPr>
+        <w:pStyle w:val="ListParagraph"/>
+        <w:numPr>
+          <w:ilvl w:val="1"/>
+          <w:numId w:val="4"/>
+        </w:numPr>
+        <w:spacing w:line="240" w:lineRule="auto"/>
+        <w:rPr>
+          <w:rFonts w:ascii="Calibri" w:hAnsi="Calibri" w:cs="Calibri"/>
+          <w:sz w:val="24"/>
+          <w:szCs w:val="24"/>
+        </w:rPr>
+      </w:pPr>
+      <w:r>
+        <w:rPr>
+          <w:rFonts w:ascii="Calibri" w:hAnsi="Calibri" w:cs="Calibri"/>
+          <w:sz w:val="24"/>
+          <w:szCs w:val="24"/>
+        </w:rPr>
+        <w:t>Integrated WebSocket to provide instant seat status updates to multiple concurrent users, ensuring data consistency.</w:t>
+      </w:r>
+    </w:p>
+    <w:p>
+      <w:pPr>
+        <w:pStyle w:val="ListParagraph"/>
+        <w:numPr>
+          <w:ilvl w:val="1"/>
+          <w:numId w:val="4"/>
+        </w:numPr>
+        <w:spacing w:line="240" w:lineRule="auto"/>
+        <w:rPr>
+          <w:rFonts w:ascii="Calibri" w:hAnsi="Calibri" w:cs="Calibri"/>
+          <w:sz w:val="24"/>
+          <w:szCs w:val="24"/>
+        </w:rPr>
+      </w:pPr>
+      <w:r>
+        <w:rPr>
+          <w:rFonts w:ascii="Calibri" w:hAnsi="Calibri" w:cs="Calibri"/>
+          <w:sz w:val="24"/>
+          <w:szCs w:val="24"/>
+        </w:rPr>
+        <w:t>Developed Spring Schedules to automate system maintenance tasks, such as clearing expired reservations and generating daily reports.</w:t>
+      </w:r>
+    </w:p>
+    <w:p>
+      <w:pPr>
+        <w:pStyle w:val="ListParagraph"/>
+        <w:numPr>
+          <w:ilvl w:val="1"/>
+          <w:numId w:val="4"/>
+        </w:numPr>
+        <w:spacing w:line="240" w:lineRule="auto"/>
+        <w:rPr>
+          <w:rFonts w:ascii="Calibri" w:hAnsi="Calibri" w:cs="Calibri"/>
+          <w:sz w:val="24"/>
+          <w:szCs w:val="24"/>
+        </w:rPr>
+      </w:pPr>
+      <w:r>
+        <w:rPr>
+          <w:rFonts w:ascii="Calibri" w:hAnsi="Calibri" w:cs="Calibri"/>
+          <w:sz w:val="24"/>
+          <w:szCs w:val="24"/>
+        </w:rPr>
+        <w:t xml:space="preserve">Managed relational data with PostgreSQL, utilizing </w:t>
+      </w:r>
+      <w:proofErr w:type="spellStart"/>
+      <w:r>
+        <w:rPr>
+          <w:rFonts w:ascii="Calibri" w:hAnsi="Calibri" w:cs="Calibri"/>
+          <w:sz w:val="24"/>
+          <w:szCs w:val="24"/>
+        </w:rPr>
+        <w:t>MyBatis</w:t>
+      </w:r>
+      <w:proofErr w:type="spellEnd"/>
+      <w:r>
+        <w:rPr>
+          <w:rFonts w:ascii="Calibri" w:hAnsi="Calibri" w:cs="Calibri"/>
+          <w:sz w:val="24"/>
+          <w:szCs w:val="24"/>
+        </w:rPr>
+        <w:t xml:space="preserve"> for precise control over complex transaction queries.</w:t>
+      </w:r>
+    </w:p>
+    <w:p>
+      <w:pPr>
+        <w:pStyle w:val="ListParagraph"/>
+        <w:numPr>
+          <w:ilvl w:val="1"/>
+          <w:numId w:val="4"/>
+        </w:numPr>
+        <w:spacing w:line="240" w:lineRule="auto"/>
+        <w:rPr>
+          <w:rFonts w:ascii="Calibri" w:hAnsi="Calibri" w:cs="Calibri"/>
+          <w:sz w:val="24"/>
+          <w:szCs w:val="24"/>
+        </w:rPr>
+      </w:pPr>
+      <w:r>
+        <w:rPr>
+          <w:rFonts w:ascii="Calibri" w:hAnsi="Calibri" w:cs="Calibri"/>
+          <w:sz w:val="24"/>
+          <w:szCs w:val="24"/>
+        </w:rPr>
+        <w:t>Configured Docker environments to ensure consistent deployment</w:t>
+      </w:r>
+      <w:r>
+        <w:rPr>
+          <w:rFonts w:ascii="Calibri" w:hAnsi="Calibri" w:cs="Calibri"/>
+          <w:sz w:val="24"/>
+          <w:szCs w:val="24"/>
+        </w:rPr>
+        <w:t>.</w:t>
+      </w:r>
+    </w:p>
+    <w:p>
+      <w:pPr>
+        <w:spacing w:line="240" w:lineRule="auto"/>
+        <w:rPr>
+          <w:rFonts w:ascii="Calibri" w:hAnsi="Calibri" w:cs="Calibri"/>
+          <w:sz w:val="24"/>
+          <w:szCs w:val="24"/>
+        </w:rPr>
+      </w:pPr>
+      <w:r>
+        <w:rPr>
+          <w:rFonts w:ascii="Calibri" w:hAnsi="Calibri" w:cs="Calibri"/>
+          <w:b/>
+          <w:sz w:val="24"/>
+          <w:szCs w:val="24"/>
+        </w:rPr>
+        <w:t>Project</w:t>
+      </w:r>
+      <w:r>
+        <w:rPr>
+          <w:rFonts w:ascii="Calibri" w:hAnsi="Calibri" w:cs="Calibri"/>
+          <w:sz w:val="24"/>
+          <w:szCs w:val="24"/>
+        </w:rPr>
+        <w:t>:</w:t>
+      </w:r>
+      <w:r>
+        <w:rPr>
+          <w:rFonts w:ascii="Calibri" w:hAnsi="Calibri" w:cs="Calibri"/>
+          <w:sz w:val="24"/>
+          <w:szCs w:val="24"/>
+        </w:rPr>
+        <w:t xml:space="preserve"> WINA Management System</w:t>
+      </w:r>
+      <w:r>
+        <w:rPr>
+          <w:rFonts w:ascii="Calibri" w:hAnsi="Calibri" w:cs="Calibri"/>
+          <w:sz w:val="24"/>
+          <w:szCs w:val="24"/>
+        </w:rPr>
+        <w:t xml:space="preserve">                    </w:t>
+      </w:r>
+      <w:r>
+        <w:rPr>
+          <w:rStyle w:val="Hyperlink"/>
+          <w:color w:val="5B9BD5" w:themeColor="accent1"/>
+          <w:sz w:val="30"/>
+          <w:szCs w:val="30"/>
+          <w:u w:val="none"/>
+        </w:rPr>
+        <w:t xml:space="preserve">      </w:t>
+      </w:r>
+      <w:r>
+        <w:rPr>
+          <w:rFonts w:ascii="Calibri" w:hAnsi="Calibri" w:cs="Calibri"/>
+          <w:sz w:val="24"/>
+          <w:szCs w:val="24"/>
+        </w:rPr>
+        <w:t xml:space="preserve">      </w:t>
+      </w:r>
+    </w:p>
+    <w:p>
+      <w:pPr>
+        <w:pStyle w:val="ListParagraph"/>
+        <w:numPr>
+          <w:ilvl w:val="0"/>
+          <w:numId w:val="1"/>
+        </w:numPr>
+        <w:spacing w:line="240" w:lineRule="auto"/>
+        <w:rPr>
+          <w:rFonts w:ascii="Calibri" w:hAnsi="Calibri" w:cs="Calibri"/>
+          <w:b/>
+          <w:sz w:val="24"/>
+          <w:szCs w:val="24"/>
+        </w:rPr>
+      </w:pPr>
+      <w:r>
+        <w:rPr>
+          <w:rFonts w:ascii="Calibri" w:hAnsi="Calibri" w:cs="Calibri"/>
+          <w:b/>
+          <w:sz w:val="24"/>
+          <w:szCs w:val="24"/>
+        </w:rPr>
+        <w:t xml:space="preserve">Description: </w:t>
+      </w:r>
+      <w:r>
+        <w:rPr>
+          <w:rFonts w:ascii="Calibri" w:hAnsi="Calibri" w:cs="Calibri"/>
+          <w:sz w:val="24"/>
+          <w:szCs w:val="24"/>
+        </w:rPr>
+        <w:t>An</w:t>
+      </w:r>
+      <w:r>
+        <w:rPr>
+          <w:rFonts w:ascii="Calibri" w:hAnsi="Calibri" w:cs="Calibri"/>
+          <w:sz w:val="24"/>
+          <w:szCs w:val="24"/>
+        </w:rPr>
+        <w:t xml:space="preserve"> </w:t>
+      </w:r>
+      <w:r>
+        <w:rPr>
+          <w:rFonts w:ascii="Calibri" w:hAnsi="Calibri" w:cs="Calibri"/>
+          <w:sz w:val="24"/>
+          <w:szCs w:val="24"/>
+        </w:rPr>
+        <w:t>internal management system designed to streamline business operations. The project focuses on handling complex data grids, ensuring secure user authentication</w:t>
+      </w:r>
+      <w:r>
+        <w:rPr>
+          <w:rFonts w:ascii="Calibri" w:hAnsi="Calibri" w:cs="Calibri"/>
+          <w:sz w:val="24"/>
+          <w:szCs w:val="24"/>
+        </w:rPr>
+        <w:t>.</w:t>
+      </w:r>
+    </w:p>
+    <w:p>
+      <w:pPr>
+        <w:pStyle w:val="ListParagraph"/>
+        <w:numPr>
+          <w:ilvl w:val="0"/>
+          <w:numId w:val="1"/>
+        </w:numPr>
+        <w:spacing w:line="240" w:lineRule="auto"/>
+        <w:rPr>
+          <w:rFonts w:ascii="Calibri" w:hAnsi="Calibri" w:cs="Calibri"/>
+          <w:b/>
+          <w:sz w:val="24"/>
+          <w:szCs w:val="24"/>
+        </w:rPr>
+      </w:pPr>
+      <w:r>
+        <w:rPr>
+          <w:rFonts w:ascii="Calibri" w:hAnsi="Calibri" w:cs="Calibri"/>
+          <w:b/>
+          <w:sz w:val="24"/>
+          <w:szCs w:val="24"/>
+        </w:rPr>
+        <w:t>Technologies:</w:t>
+      </w:r>
+    </w:p>
+    <w:p>
+      <w:pPr>
+        <w:pStyle w:val="ListParagraph"/>
+        <w:numPr>
+          <w:ilvl w:val="0"/>
+          <w:numId w:val="2"/>
+        </w:numPr>
+        <w:spacing w:line="240" w:lineRule="auto"/>
+        <w:rPr>
+          <w:rFonts w:ascii="Calibri" w:hAnsi="Calibri" w:cs="Calibri"/>
+          <w:b/>
+          <w:sz w:val="24"/>
+          <w:szCs w:val="24"/>
+        </w:rPr>
+      </w:pPr>
+      <w:r>
+        <w:rPr>
+          <w:rFonts w:ascii="Calibri" w:hAnsi="Calibri" w:cs="Calibri"/>
+          <w:b/>
+          <w:sz w:val="24"/>
+          <w:szCs w:val="24"/>
+        </w:rPr>
+        <w:t xml:space="preserve">Back-end: </w:t>
+      </w:r>
+      <w:r>
+        <w:rPr>
+          <w:rFonts w:ascii="Calibri" w:hAnsi="Calibri" w:cs="Calibri"/>
+          <w:sz w:val="24"/>
+          <w:szCs w:val="24"/>
+        </w:rPr>
+        <w:t xml:space="preserve">Spring Boot, Spring Security, </w:t>
+      </w:r>
+      <w:proofErr w:type="spellStart"/>
+      <w:r>
+        <w:rPr>
+          <w:rFonts w:ascii="Calibri" w:hAnsi="Calibri" w:cs="Calibri"/>
+          <w:sz w:val="24"/>
+          <w:szCs w:val="24"/>
+        </w:rPr>
+        <w:t>MyBatis</w:t>
+      </w:r>
+      <w:proofErr w:type="spellEnd"/>
+      <w:r>
+        <w:rPr>
+          <w:rFonts w:ascii="Calibri" w:hAnsi="Calibri" w:cs="Calibri"/>
+          <w:sz w:val="24"/>
+          <w:szCs w:val="24"/>
+        </w:rPr>
+        <w:t xml:space="preserve">, Spring </w:t>
+      </w:r>
+      <w:proofErr w:type="spellStart"/>
+      <w:r>
+        <w:rPr>
+          <w:rFonts w:ascii="Calibri" w:hAnsi="Calibri" w:cs="Calibri"/>
+          <w:sz w:val="24"/>
+          <w:szCs w:val="24"/>
+        </w:rPr>
+        <w:t>Webflux</w:t>
+      </w:r>
+      <w:proofErr w:type="spellEnd"/>
+      <w:r>
+        <w:rPr>
+          <w:rFonts w:ascii="Calibri" w:hAnsi="Calibri" w:cs="Calibri"/>
+          <w:sz w:val="24"/>
+          <w:szCs w:val="24"/>
+        </w:rPr>
+        <w:t>, Hibernate.</w:t>
+      </w:r>
+    </w:p>
+    <w:p>
+      <w:pPr>
+        <w:pStyle w:val="ListParagraph"/>
+        <w:numPr>
+          <w:ilvl w:val="0"/>
+          <w:numId w:val="2"/>
+        </w:numPr>
+        <w:spacing w:line="240" w:lineRule="auto"/>
+        <w:rPr>
+          <w:rFonts w:ascii="Calibri" w:hAnsi="Calibri" w:cs="Calibri"/>
+          <w:b/>
+          <w:sz w:val="24"/>
+          <w:szCs w:val="24"/>
+        </w:rPr>
+      </w:pPr>
+      <w:r>
+        <w:rPr>
+          <w:rFonts w:ascii="Calibri" w:hAnsi="Calibri" w:cs="Calibri"/>
+          <w:b/>
+          <w:sz w:val="24"/>
+          <w:szCs w:val="24"/>
+        </w:rPr>
+        <w:t>Front-end:</w:t>
+      </w:r>
+      <w:r>
+        <w:rPr>
+          <w:rFonts w:ascii="Calibri" w:hAnsi="Calibri" w:cs="Calibri"/>
+          <w:bCs/>
+          <w:sz w:val="24"/>
+          <w:szCs w:val="24"/>
+        </w:rPr>
+        <w:t xml:space="preserve"> </w:t>
+      </w:r>
+      <w:r>
+        <w:rPr>
+          <w:rFonts w:ascii="Calibri" w:hAnsi="Calibri" w:cs="Calibri"/>
+          <w:bCs/>
+          <w:sz w:val="24"/>
+          <w:szCs w:val="24"/>
+        </w:rPr>
+        <w:t>React, TypeScript, Vite, Material UI, React Hook Form.</w:t>
+      </w:r>
+    </w:p>
+    <w:p>
+      <w:pPr>
+        <w:pStyle w:val="ListParagraph"/>
+        <w:numPr>
+          <w:ilvl w:val="0"/>
+          <w:numId w:val="2"/>
+        </w:numPr>
+        <w:spacing w:line="240" w:lineRule="auto"/>
+        <w:rPr>
+          <w:rFonts w:ascii="Calibri" w:hAnsi="Calibri" w:cs="Calibri"/>
+          <w:b/>
+          <w:sz w:val="24"/>
+          <w:szCs w:val="24"/>
+        </w:rPr>
+      </w:pPr>
+      <w:r>
+        <w:rPr>
+          <w:rFonts w:ascii="Calibri" w:hAnsi="Calibri" w:cs="Calibri"/>
+          <w:b/>
+          <w:sz w:val="24"/>
+          <w:szCs w:val="24"/>
+        </w:rPr>
+        <w:t>Database:</w:t>
+      </w:r>
+      <w:r>
+        <w:rPr>
+          <w:rFonts w:ascii="Calibri" w:hAnsi="Calibri" w:cs="Calibri"/>
+          <w:b/>
+          <w:sz w:val="24"/>
+          <w:szCs w:val="24"/>
+        </w:rPr>
+        <w:t xml:space="preserve"> </w:t>
+      </w:r>
+      <w:r>
+        <w:rPr>
+          <w:rFonts w:ascii="Calibri" w:hAnsi="Calibri" w:cs="Calibri"/>
+          <w:bCs/>
+          <w:sz w:val="24"/>
+          <w:szCs w:val="24"/>
+        </w:rPr>
+        <w:t>Oracle DB.</w:t>
+      </w:r>
+    </w:p>
+    <w:p>
+      <w:pPr>
+        <w:pStyle w:val="ListParagraph"/>
+        <w:numPr>
+          <w:ilvl w:val="0"/>
+          <w:numId w:val="2"/>
+        </w:numPr>
+        <w:spacing w:line="240" w:lineRule="auto"/>
+        <w:rPr>
+          <w:rFonts w:ascii="Calibri" w:hAnsi="Calibri" w:cs="Calibri"/>
+          <w:b/>
+          <w:sz w:val="24"/>
+          <w:szCs w:val="24"/>
+        </w:rPr>
+      </w:pPr>
+      <w:r>
+        <w:rPr>
+          <w:rFonts w:ascii="Calibri" w:hAnsi="Calibri" w:cs="Calibri"/>
+          <w:b/>
+          <w:sz w:val="24"/>
+          <w:szCs w:val="24"/>
+        </w:rPr>
+        <w:t xml:space="preserve">DevOps: </w:t>
+      </w:r>
+      <w:r>
+        <w:rPr>
+          <w:rFonts w:ascii="Calibri" w:hAnsi="Calibri" w:cs="Calibri"/>
+          <w:sz w:val="24"/>
+          <w:szCs w:val="24"/>
+        </w:rPr>
+        <w:t>Docker, SonarQube, Gradle, AWS (S3/ECR).</w:t>
+      </w:r>
+    </w:p>
+    <w:p>
+      <w:pPr>
+        <w:pStyle w:val="ListParagraph"/>
+        <w:numPr>
+          <w:ilvl w:val="0"/>
+          <w:numId w:val="1"/>
+        </w:numPr>
+        <w:spacing w:line="240" w:lineRule="auto"/>
+        <w:rPr>
+          <w:rFonts w:ascii="Calibri" w:hAnsi="Calibri" w:cs="Calibri"/>
+          <w:b/>
+          <w:sz w:val="24"/>
+          <w:szCs w:val="24"/>
+        </w:rPr>
+      </w:pPr>
+      <w:r>
+        <w:rPr>
+          <w:rFonts w:ascii="Calibri" w:hAnsi="Calibri" w:cs="Calibri"/>
+          <w:b/>
+          <w:sz w:val="24"/>
+          <w:szCs w:val="24"/>
+        </w:rPr>
+        <w:lastRenderedPageBreak/>
+        <w:t>Responsibilities:</w:t>
+      </w:r>
+    </w:p>
+    <w:p>
+      <w:pPr>
+        <w:pStyle w:val="ListParagraph"/>
+        <w:numPr>
+          <w:ilvl w:val="1"/>
+          <w:numId w:val="4"/>
+        </w:numPr>
+        <w:spacing w:line="240" w:lineRule="auto"/>
+        <w:rPr>
+          <w:rFonts w:ascii="Calibri" w:hAnsi="Calibri" w:cs="Calibri"/>
+          <w:sz w:val="24"/>
+          <w:szCs w:val="24"/>
+        </w:rPr>
+      </w:pPr>
+      <w:r>
+        <w:rPr>
+          <w:rFonts w:ascii="Calibri" w:hAnsi="Calibri" w:cs="Calibri"/>
+          <w:sz w:val="24"/>
+          <w:szCs w:val="24"/>
+        </w:rPr>
+        <w:t>Developed RESTful APIs, ensuring clean and maintainable code architecture.</w:t>
+      </w:r>
+    </w:p>
+    <w:p>
+      <w:pPr>
+        <w:pStyle w:val="ListParagraph"/>
+        <w:numPr>
+          <w:ilvl w:val="1"/>
+          <w:numId w:val="4"/>
+        </w:numPr>
+        <w:spacing w:line="240" w:lineRule="auto"/>
+        <w:rPr>
+          <w:rFonts w:ascii="Calibri" w:hAnsi="Calibri" w:cs="Calibri"/>
+          <w:sz w:val="24"/>
+          <w:szCs w:val="24"/>
+        </w:rPr>
+      </w:pPr>
+      <w:r>
+        <w:rPr>
+          <w:rFonts w:ascii="Calibri" w:hAnsi="Calibri" w:cs="Calibri"/>
+          <w:sz w:val="24"/>
+          <w:szCs w:val="24"/>
+        </w:rPr>
+        <w:t>I</w:t>
+      </w:r>
+      <w:r>
+        <w:rPr>
+          <w:rFonts w:ascii="Calibri" w:hAnsi="Calibri" w:cs="Calibri"/>
+          <w:sz w:val="24"/>
+          <w:szCs w:val="24"/>
+        </w:rPr>
+        <w:t>mplemented secure authentication and authorization layers using Spring Security and JWT</w:t>
+      </w:r>
+      <w:r>
+        <w:rPr>
+          <w:rFonts w:ascii="Calibri" w:hAnsi="Calibri" w:cs="Calibri"/>
+          <w:sz w:val="24"/>
+          <w:szCs w:val="24"/>
+        </w:rPr>
+        <w:t>.</w:t>
+      </w:r>
+    </w:p>
+    <w:p>
+      <w:pPr>
+        <w:pStyle w:val="ListParagraph"/>
+        <w:numPr>
+          <w:ilvl w:val="1"/>
+          <w:numId w:val="4"/>
+        </w:numPr>
+        <w:spacing w:line="240" w:lineRule="auto"/>
+        <w:rPr>
+          <w:rFonts w:ascii="Calibri" w:hAnsi="Calibri" w:cs="Calibri"/>
+          <w:sz w:val="24"/>
+          <w:szCs w:val="24"/>
+        </w:rPr>
+      </w:pPr>
+      <w:r>
+        <w:rPr>
+          <w:rFonts w:ascii="Calibri" w:hAnsi="Calibri" w:cs="Calibri"/>
+          <w:sz w:val="24"/>
+          <w:szCs w:val="24"/>
+        </w:rPr>
+        <w:t xml:space="preserve">Designed database schemas and </w:t>
+      </w:r>
+      <w:r>
+        <w:rPr>
+          <w:rFonts w:ascii="Calibri" w:hAnsi="Calibri" w:cs="Calibri"/>
+          <w:sz w:val="24"/>
+          <w:szCs w:val="24"/>
+        </w:rPr>
+        <w:t xml:space="preserve">ERD </w:t>
+      </w:r>
+      <w:r>
+        <w:rPr>
+          <w:rFonts w:ascii="Calibri" w:hAnsi="Calibri" w:cs="Calibri"/>
+          <w:sz w:val="24"/>
+          <w:szCs w:val="24"/>
+        </w:rPr>
+        <w:t>to support complex business logic and data persistence requirements.</w:t>
+      </w:r>
+    </w:p>
+    <w:p>
+      <w:pPr>
+        <w:pStyle w:val="ListParagraph"/>
+        <w:numPr>
+          <w:ilvl w:val="1"/>
+          <w:numId w:val="4"/>
+        </w:numPr>
+        <w:spacing w:line="240" w:lineRule="auto"/>
+        <w:rPr>
+          <w:rFonts w:ascii="Calibri" w:hAnsi="Calibri" w:cs="Calibri"/>
+          <w:sz w:val="24"/>
+          <w:szCs w:val="24"/>
+        </w:rPr>
+      </w:pPr>
+      <w:r>
+        <w:rPr>
+          <w:rFonts w:ascii="Calibri" w:hAnsi="Calibri" w:cs="Calibri"/>
+          <w:sz w:val="24"/>
+          <w:szCs w:val="24"/>
+        </w:rPr>
+        <w:t>Worked with Oracle</w:t>
+      </w:r>
+      <w:r>
+        <w:rPr>
+          <w:rFonts w:ascii="Calibri" w:hAnsi="Calibri" w:cs="Calibri"/>
+          <w:sz w:val="24"/>
+          <w:szCs w:val="24"/>
+        </w:rPr>
+        <w:t xml:space="preserve"> </w:t>
+      </w:r>
+      <w:r>
+        <w:rPr>
+          <w:rFonts w:ascii="Calibri" w:hAnsi="Calibri" w:cs="Calibri"/>
+          <w:sz w:val="24"/>
+          <w:szCs w:val="24"/>
+        </w:rPr>
+        <w:t xml:space="preserve">databases, utilizing </w:t>
+      </w:r>
+      <w:proofErr w:type="spellStart"/>
+      <w:r>
+        <w:rPr>
+          <w:rFonts w:ascii="Calibri" w:hAnsi="Calibri" w:cs="Calibri"/>
+          <w:sz w:val="24"/>
+          <w:szCs w:val="24"/>
+        </w:rPr>
+        <w:t>MyBatis</w:t>
+      </w:r>
+      <w:proofErr w:type="spellEnd"/>
+      <w:r>
+        <w:rPr>
+          <w:rFonts w:ascii="Calibri" w:hAnsi="Calibri" w:cs="Calibri"/>
+          <w:sz w:val="24"/>
+          <w:szCs w:val="24"/>
+        </w:rPr>
+        <w:t xml:space="preserve"> </w:t>
+      </w:r>
+      <w:r>
+        <w:rPr>
+          <w:rFonts w:ascii="Calibri" w:hAnsi="Calibri" w:cs="Calibri"/>
+          <w:sz w:val="24"/>
+          <w:szCs w:val="24"/>
+        </w:rPr>
+        <w:t>for efficient data mapping and query optimization.</w:t>
+      </w:r>
+    </w:p>
+    <w:p>
+      <w:pPr>
+        <w:pStyle w:val="ListParagraph"/>
+        <w:numPr>
+          <w:ilvl w:val="1"/>
+          <w:numId w:val="4"/>
+        </w:numPr>
+        <w:spacing w:line="240" w:lineRule="auto"/>
+        <w:rPr>
+          <w:rFonts w:ascii="Calibri" w:hAnsi="Calibri" w:cs="Calibri"/>
+          <w:sz w:val="24"/>
+          <w:szCs w:val="24"/>
+        </w:rPr>
+      </w:pPr>
+      <w:r>
+        <w:rPr>
+          <w:rFonts w:ascii="Calibri" w:hAnsi="Calibri" w:cs="Calibri"/>
+          <w:sz w:val="24"/>
+          <w:szCs w:val="24"/>
+        </w:rPr>
+        <w:t>Built</w:t>
+      </w:r>
+      <w:r>
+        <w:rPr>
+          <w:rFonts w:ascii="Calibri" w:hAnsi="Calibri" w:cs="Calibri"/>
+          <w:sz w:val="24"/>
+          <w:szCs w:val="24"/>
+        </w:rPr>
+        <w:t xml:space="preserve"> dynamic interfaces</w:t>
+      </w:r>
+      <w:r>
+        <w:rPr>
+          <w:rFonts w:ascii="Calibri" w:hAnsi="Calibri" w:cs="Calibri"/>
+          <w:sz w:val="24"/>
+          <w:szCs w:val="24"/>
+        </w:rPr>
+        <w:t>, to display and manipulate enterprise-scale data.</w:t>
       </w:r>
     </w:p>
     <w:p>
@@ -1540,16 +2922,33 @@
           <w:sz w:val="24"/>
           <w:szCs w:val="24"/>
         </w:rPr>
-        <w:t xml:space="preserve"> Flash Card Amin Web</w:t>
-      </w:r>
-      <w:r>
-        <w:rPr>
-          <w:rFonts w:ascii="Calibri" w:hAnsi="Calibri" w:cs="Calibri"/>
-          <w:b/>
-          <w:sz w:val="24"/>
-          <w:szCs w:val="24"/>
-        </w:rPr>
-        <w:t xml:space="preserve">                    </w:t>
+        <w:t xml:space="preserve"> Flash Card </w:t>
+      </w:r>
+      <w:r>
+        <w:rPr>
+          <w:rFonts w:ascii="Calibri" w:hAnsi="Calibri" w:cs="Calibri"/>
+          <w:sz w:val="24"/>
+          <w:szCs w:val="24"/>
+        </w:rPr>
+        <w:t>Learning System</w:t>
+      </w:r>
+      <w:r>
+        <w:rPr>
+          <w:rFonts w:ascii="Calibri" w:hAnsi="Calibri" w:cs="Calibri"/>
+          <w:b/>
+          <w:sz w:val="24"/>
+          <w:szCs w:val="24"/>
+        </w:rPr>
+        <w:t xml:space="preserve">               </w:t>
+      </w:r>
+      <w:r>
+        <w:rPr>
+          <w:rFonts w:ascii="Calibri" w:hAnsi="Calibri" w:cs="Calibri"/>
+          <w:b/>
+          <w:sz w:val="24"/>
+          <w:szCs w:val="24"/>
+        </w:rPr>
+        <w:tab/>
       </w:r>
       <w:r>
         <w:rPr>
@@ -1574,14 +2973,23 @@
           <w:color w:val="auto"/>
           <w:u w:val="none"/>
         </w:rPr>
-        <w:t xml:space="preserve">        </w:t>
-      </w:r>
+        <w:t xml:space="preserve">      </w:t>
+      </w:r>
+      <w:proofErr w:type="gramStart"/>
       <w:r>
         <w:rPr>
           <w:rStyle w:val="Hyperlink"/>
           <w:color w:val="auto"/>
           <w:u w:val="none"/>
         </w:rPr>
+        <w:t xml:space="preserve">  </w:t>
+      </w:r>
+      <w:r>
+        <w:rPr>
+          <w:rStyle w:val="Hyperlink"/>
+          <w:color w:val="auto"/>
+          <w:u w:val="none"/>
+        </w:rPr>
         <w:t xml:space="preserve"> </w:t>
       </w:r>
       <w:r>
@@ -1595,6 +3003,495 @@
         </w:rPr>
         <w:t>(</w:t>
       </w:r>
+      <w:proofErr w:type="gramEnd"/>
+      <w:r>
+        <w:fldChar w:fldCharType="begin"/>
+      </w:r>
+      <w:r>
+        <w:instrText>HYPERLINK "https://github.com/neekon2508/DATN"</w:instrText>
+      </w:r>
+      <w:r>
+        <w:fldChar w:fldCharType="separate"/>
+      </w:r>
+      <w:r>
+        <w:rPr>
+          <w:rStyle w:val="Hyperlink"/>
+          <w:rFonts w:ascii="Calibri" w:hAnsi="Calibri" w:cs="Calibri"/>
+          <w:color w:val="2F5496" w:themeColor="accent5" w:themeShade="BF"/>
+          <w:sz w:val="24"/>
+          <w:szCs w:val="24"/>
+          <w:u w:val="none"/>
+        </w:rPr>
+        <w:t>Chec</w:t>
+      </w:r>
+      <w:r>
+        <w:rPr>
+          <w:rStyle w:val="Hyperlink"/>
+          <w:rFonts w:ascii="Calibri" w:hAnsi="Calibri" w:cs="Calibri"/>
+          <w:color w:val="2F5496" w:themeColor="accent5" w:themeShade="BF"/>
+          <w:sz w:val="24"/>
+          <w:szCs w:val="24"/>
+          <w:u w:val="none"/>
+        </w:rPr>
+        <w:t>k</w:t>
+      </w:r>
+      <w:r>
+        <w:rPr>
+          <w:rStyle w:val="Hyperlink"/>
+          <w:rFonts w:ascii="Calibri" w:hAnsi="Calibri" w:cs="Calibri"/>
+          <w:color w:val="2F5496" w:themeColor="accent5" w:themeShade="BF"/>
+          <w:sz w:val="24"/>
+          <w:szCs w:val="24"/>
+          <w:u w:val="none"/>
+        </w:rPr>
+        <w:t xml:space="preserve"> here</w:t>
+      </w:r>
+      <w:r>
+        <w:fldChar w:fldCharType="end"/>
+      </w:r>
+      <w:r>
+        <w:rPr>
+          <w:rStyle w:val="Hyperlink"/>
+          <w:rFonts w:ascii="Calibri" w:hAnsi="Calibri" w:cs="Calibri"/>
+          <w:color w:val="2F5496" w:themeColor="accent5" w:themeShade="BF"/>
+          <w:sz w:val="24"/>
+          <w:szCs w:val="24"/>
+          <w:u w:val="none"/>
+        </w:rPr>
+        <w:t>)</w:t>
+      </w:r>
+      <w:r>
+        <w:rPr>
+          <w:rStyle w:val="Hyperlink"/>
+          <w:color w:val="auto"/>
+          <w:u w:val="none"/>
+        </w:rPr>
+        <w:t xml:space="preserve">     </w:t>
+      </w:r>
+      <w:r>
+        <w:rPr>
+          <w:rStyle w:val="Hyperlink"/>
+          <w:color w:val="auto"/>
+          <w:u w:val="none"/>
+        </w:rPr>
+        <w:tab/>
+      </w:r>
+      <w:r>
+        <w:rPr>
+          <w:rStyle w:val="Hyperlink"/>
+          <w:color w:val="auto"/>
+          <w:u w:val="none"/>
+        </w:rPr>
+        <w:tab/>
+      </w:r>
+      <w:r>
+        <w:rPr>
+          <w:rStyle w:val="Hyperlink"/>
+          <w:color w:val="auto"/>
+          <w:u w:val="none"/>
+        </w:rPr>
+        <w:t xml:space="preserve"> </w:t>
+      </w:r>
+      <w:r>
+        <w:rPr>
+          <w:rFonts w:ascii="Calibri" w:hAnsi="Calibri" w:cs="Calibri"/>
+          <w:b/>
+          <w:sz w:val="24"/>
+          <w:szCs w:val="24"/>
+        </w:rPr>
+        <w:t>03/2025-05/2025</w:t>
+      </w:r>
+    </w:p>
+    <w:p>
+      <w:pPr>
+        <w:pStyle w:val="ListParagraph"/>
+        <w:numPr>
+          <w:ilvl w:val="0"/>
+          <w:numId w:val="1"/>
+        </w:numPr>
+        <w:spacing w:line="240" w:lineRule="auto"/>
+        <w:rPr>
+          <w:rFonts w:ascii="Calibri" w:hAnsi="Calibri" w:cs="Calibri"/>
+          <w:sz w:val="24"/>
+          <w:szCs w:val="24"/>
+        </w:rPr>
+      </w:pPr>
+      <w:r>
+        <w:rPr>
+          <w:rFonts w:ascii="Calibri" w:hAnsi="Calibri" w:cs="Calibri"/>
+          <w:b/>
+          <w:sz w:val="24"/>
+          <w:szCs w:val="24"/>
+        </w:rPr>
+        <w:t>Description</w:t>
+      </w:r>
+      <w:r>
+        <w:rPr>
+          <w:rFonts w:ascii="Calibri" w:hAnsi="Calibri" w:cs="Calibri"/>
+          <w:sz w:val="24"/>
+          <w:szCs w:val="24"/>
+        </w:rPr>
+        <w:t xml:space="preserve">: </w:t>
+      </w:r>
+      <w:r>
+        <w:rPr>
+          <w:rFonts w:ascii="Calibri" w:hAnsi="Calibri" w:cs="Calibri"/>
+          <w:sz w:val="24"/>
+          <w:szCs w:val="24"/>
+        </w:rPr>
+        <w:t xml:space="preserve">Developed a comprehensive English learning platform comprising a Spring Boot RESTful API, a </w:t>
+      </w:r>
+      <w:proofErr w:type="spellStart"/>
+      <w:r>
+        <w:rPr>
+          <w:rFonts w:ascii="Calibri" w:hAnsi="Calibri" w:cs="Calibri"/>
+          <w:sz w:val="24"/>
+          <w:szCs w:val="24"/>
+        </w:rPr>
+        <w:t>Thymeleaf</w:t>
+      </w:r>
+      <w:proofErr w:type="spellEnd"/>
+      <w:r>
+        <w:rPr>
+          <w:rFonts w:ascii="Calibri" w:hAnsi="Calibri" w:cs="Calibri"/>
+          <w:sz w:val="24"/>
+          <w:szCs w:val="24"/>
+        </w:rPr>
+        <w:t xml:space="preserve">-based Admin Panel, and a Native Android </w:t>
+      </w:r>
+      <w:r>
+        <w:rPr>
+          <w:rFonts w:ascii="Calibri" w:hAnsi="Calibri" w:cs="Calibri"/>
+          <w:sz w:val="24"/>
+          <w:szCs w:val="24"/>
+        </w:rPr>
+        <w:t>a</w:t>
+      </w:r>
+      <w:r>
+        <w:rPr>
+          <w:rFonts w:ascii="Calibri" w:hAnsi="Calibri" w:cs="Calibri"/>
+          <w:sz w:val="24"/>
+          <w:szCs w:val="24"/>
+        </w:rPr>
+        <w:t>pplication for real-time data synchronization.</w:t>
+      </w:r>
+    </w:p>
+    <w:p>
+      <w:pPr>
+        <w:pStyle w:val="ListParagraph"/>
+        <w:numPr>
+          <w:ilvl w:val="1"/>
+          <w:numId w:val="4"/>
+        </w:numPr>
+        <w:spacing w:line="240" w:lineRule="auto"/>
+        <w:rPr>
+          <w:rFonts w:ascii="Calibri" w:hAnsi="Calibri" w:cs="Calibri"/>
+          <w:sz w:val="24"/>
+          <w:szCs w:val="24"/>
+        </w:rPr>
+      </w:pPr>
+      <w:bookmarkStart w:id="0" w:name="_Hlk219147745"/>
+      <w:r>
+        <w:rPr>
+          <w:rFonts w:ascii="Calibri" w:hAnsi="Calibri" w:cs="Calibri"/>
+          <w:b/>
+          <w:bCs/>
+          <w:sz w:val="24"/>
+          <w:szCs w:val="24"/>
+        </w:rPr>
+        <w:t>Backend &amp; Admin Web</w:t>
+      </w:r>
+      <w:bookmarkEnd w:id="0"/>
+      <w:r>
+        <w:rPr>
+          <w:rFonts w:ascii="Calibri" w:hAnsi="Calibri" w:cs="Calibri"/>
+          <w:sz w:val="24"/>
+          <w:szCs w:val="24"/>
+        </w:rPr>
+        <w:t>: Implemented core CRUD operations and an Admin Dashboard to manage Users and Flashcard Sets.</w:t>
+      </w:r>
+    </w:p>
+    <w:p>
+      <w:pPr>
+        <w:pStyle w:val="ListParagraph"/>
+        <w:numPr>
+          <w:ilvl w:val="1"/>
+          <w:numId w:val="4"/>
+        </w:numPr>
+        <w:spacing w:line="240" w:lineRule="auto"/>
+        <w:rPr>
+          <w:rFonts w:ascii="Calibri" w:hAnsi="Calibri" w:cs="Calibri"/>
+          <w:sz w:val="24"/>
+          <w:szCs w:val="24"/>
+        </w:rPr>
+      </w:pPr>
+      <w:bookmarkStart w:id="1" w:name="_Hlk219147749"/>
+      <w:r>
+        <w:rPr>
+          <w:rFonts w:ascii="Calibri" w:hAnsi="Calibri" w:cs="Calibri"/>
+          <w:b/>
+          <w:bCs/>
+          <w:sz w:val="24"/>
+          <w:szCs w:val="24"/>
+        </w:rPr>
+        <w:t>Security</w:t>
+      </w:r>
+      <w:bookmarkEnd w:id="1"/>
+      <w:r>
+        <w:rPr>
+          <w:rFonts w:ascii="Calibri" w:hAnsi="Calibri" w:cs="Calibri"/>
+          <w:sz w:val="24"/>
+          <w:szCs w:val="24"/>
+        </w:rPr>
+        <w:t>: Secured the system using Spring Security with Role-Based Access Control (RBAC) to protect sensitive data and administrative functions.</w:t>
+      </w:r>
+    </w:p>
+    <w:p>
+      <w:pPr>
+        <w:pStyle w:val="ListParagraph"/>
+        <w:numPr>
+          <w:ilvl w:val="1"/>
+          <w:numId w:val="4"/>
+        </w:numPr>
+        <w:spacing w:line="240" w:lineRule="auto"/>
+        <w:rPr>
+          <w:rFonts w:ascii="Calibri" w:hAnsi="Calibri" w:cs="Calibri"/>
+          <w:sz w:val="24"/>
+          <w:szCs w:val="24"/>
+        </w:rPr>
+      </w:pPr>
+      <w:bookmarkStart w:id="2" w:name="_Hlk219147757"/>
+      <w:r>
+        <w:rPr>
+          <w:rFonts w:ascii="Calibri" w:hAnsi="Calibri" w:cs="Calibri"/>
+          <w:b/>
+          <w:bCs/>
+          <w:sz w:val="24"/>
+          <w:szCs w:val="24"/>
+        </w:rPr>
+        <w:t>Mobile Development</w:t>
+      </w:r>
+      <w:bookmarkEnd w:id="2"/>
+      <w:r>
+        <w:rPr>
+          <w:rFonts w:ascii="Calibri" w:hAnsi="Calibri" w:cs="Calibri"/>
+          <w:sz w:val="24"/>
+          <w:szCs w:val="24"/>
+        </w:rPr>
+        <w:t>: Built an Android app featuring interactive flip-cards and quiz modes, utilizing Retrofit for seamless API integration and data syncing.</w:t>
+      </w:r>
+    </w:p>
+    <w:p>
+      <w:pPr>
+        <w:pStyle w:val="ListParagraph"/>
+        <w:numPr>
+          <w:ilvl w:val="1"/>
+          <w:numId w:val="4"/>
+        </w:numPr>
+        <w:spacing w:line="240" w:lineRule="auto"/>
+        <w:rPr>
+          <w:rFonts w:ascii="Calibri" w:hAnsi="Calibri" w:cs="Calibri"/>
+          <w:sz w:val="24"/>
+          <w:szCs w:val="24"/>
+        </w:rPr>
+      </w:pPr>
+      <w:bookmarkStart w:id="3" w:name="_Hlk219147762"/>
+      <w:r>
+        <w:rPr>
+          <w:rFonts w:ascii="Calibri" w:hAnsi="Calibri" w:cs="Calibri"/>
+          <w:b/>
+          <w:bCs/>
+          <w:sz w:val="24"/>
+          <w:szCs w:val="24"/>
+        </w:rPr>
+        <w:t>Deployment</w:t>
+      </w:r>
+      <w:bookmarkEnd w:id="3"/>
+      <w:r>
+        <w:rPr>
+          <w:rFonts w:ascii="Calibri" w:hAnsi="Calibri" w:cs="Calibri"/>
+          <w:sz w:val="24"/>
+          <w:szCs w:val="24"/>
+        </w:rPr>
+        <w:t>: Managed the application lifecycle from development to production hosting on AWS Server.</w:t>
+      </w:r>
+    </w:p>
+    <w:p>
+      <w:pPr>
+        <w:pStyle w:val="ListParagraph"/>
+        <w:numPr>
+          <w:ilvl w:val="0"/>
+          <w:numId w:val="1"/>
+        </w:numPr>
+        <w:spacing w:line="240" w:lineRule="auto"/>
+        <w:rPr>
+          <w:rFonts w:ascii="Calibri" w:hAnsi="Calibri" w:cs="Calibri"/>
+          <w:sz w:val="24"/>
+          <w:szCs w:val="24"/>
+        </w:rPr>
+      </w:pPr>
+      <w:r>
+        <w:rPr>
+          <w:rFonts w:ascii="Calibri" w:hAnsi="Calibri" w:cs="Calibri"/>
+          <w:b/>
+          <w:sz w:val="24"/>
+          <w:szCs w:val="24"/>
+        </w:rPr>
+        <w:t>Technologies</w:t>
+      </w:r>
+      <w:r>
+        <w:rPr>
+          <w:rFonts w:ascii="Calibri" w:hAnsi="Calibri" w:cs="Calibri"/>
+          <w:sz w:val="24"/>
+          <w:szCs w:val="24"/>
+        </w:rPr>
+        <w:t>:</w:t>
+      </w:r>
+      <w:r>
+        <w:rPr>
+          <w:rFonts w:ascii="Calibri" w:hAnsi="Calibri" w:cs="Calibri"/>
+          <w:sz w:val="24"/>
+          <w:szCs w:val="24"/>
+        </w:rPr>
+        <w:t xml:space="preserve"> </w:t>
+      </w:r>
+      <w:bookmarkStart w:id="4" w:name="_Hlk219147769"/>
+      <w:r>
+        <w:rPr>
+          <w:rFonts w:ascii="Calibri" w:hAnsi="Calibri" w:cs="Calibri"/>
+          <w:sz w:val="24"/>
+          <w:szCs w:val="24"/>
+        </w:rPr>
+        <w:t xml:space="preserve">Spring Boot, Spring Security, Spring Data JPA, Hibernate, MySQL, RESTful API, Retrofit, Java (Android), Android Jetpack, </w:t>
+      </w:r>
+      <w:proofErr w:type="spellStart"/>
+      <w:r>
+        <w:rPr>
+          <w:rFonts w:ascii="Calibri" w:hAnsi="Calibri" w:cs="Calibri"/>
+          <w:sz w:val="24"/>
+          <w:szCs w:val="24"/>
+        </w:rPr>
+        <w:t>Thymeleaf</w:t>
+      </w:r>
+      <w:proofErr w:type="spellEnd"/>
+      <w:r>
+        <w:rPr>
+          <w:rFonts w:ascii="Calibri" w:hAnsi="Calibri" w:cs="Calibri"/>
+          <w:sz w:val="24"/>
+          <w:szCs w:val="24"/>
+        </w:rPr>
+        <w:t>, Bootstrap, Git/GitHub, AWS</w:t>
+      </w:r>
+      <w:r>
+        <w:rPr>
+          <w:rFonts w:ascii="Calibri" w:hAnsi="Calibri" w:cs="Calibri"/>
+          <w:sz w:val="24"/>
+          <w:szCs w:val="24"/>
+        </w:rPr>
+        <w:t>.</w:t>
+      </w:r>
+      <w:r>
+        <w:rPr>
+          <w:rFonts w:ascii="Calibri" w:hAnsi="Calibri" w:cs="Calibri"/>
+          <w:sz w:val="24"/>
+          <w:szCs w:val="24"/>
+        </w:rPr>
+        <w:t xml:space="preserve"> </w:t>
+      </w:r>
+      <w:bookmarkEnd w:id="4"/>
+    </w:p>
+    <w:p>
+      <w:pPr>
+        <w:spacing w:line="240" w:lineRule="auto"/>
+        <w:rPr>
+          <w:rStyle w:val="Hyperlink"/>
+          <w:color w:val="auto"/>
+          <w:u w:val="none"/>
+        </w:rPr>
+      </w:pPr>
+      <w:r>
+        <w:rPr>
+          <w:rFonts w:ascii="Calibri" w:hAnsi="Calibri" w:cs="Calibri"/>
+          <w:b/>
+          <w:sz w:val="24"/>
+          <w:szCs w:val="24"/>
+        </w:rPr>
+        <w:t>Project:</w:t>
+      </w:r>
+      <w:r>
+        <w:rPr>
+          <w:rFonts w:ascii="Calibri" w:hAnsi="Calibri" w:cs="Calibri"/>
+          <w:sz w:val="24"/>
+          <w:szCs w:val="24"/>
+        </w:rPr>
+        <w:t xml:space="preserve"> </w:t>
+      </w:r>
+      <w:proofErr w:type="spellStart"/>
+      <w:r>
+        <w:rPr>
+          <w:rFonts w:ascii="Calibri" w:hAnsi="Calibri" w:cs="Calibri"/>
+          <w:sz w:val="24"/>
+          <w:szCs w:val="24"/>
+        </w:rPr>
+        <w:t>Pomofocus</w:t>
+      </w:r>
+      <w:proofErr w:type="spellEnd"/>
+      <w:r>
+        <w:rPr>
+          <w:rFonts w:ascii="Calibri" w:hAnsi="Calibri" w:cs="Calibri"/>
+          <w:sz w:val="24"/>
+          <w:szCs w:val="24"/>
+        </w:rPr>
+        <w:t xml:space="preserve"> Web App</w:t>
+      </w:r>
+      <w:r>
+        <w:rPr>
+          <w:rFonts w:ascii="Calibri" w:hAnsi="Calibri" w:cs="Calibri"/>
+          <w:b/>
+          <w:sz w:val="24"/>
+          <w:szCs w:val="24"/>
+        </w:rPr>
+        <w:t xml:space="preserve">               </w:t>
+      </w:r>
+      <w:r>
+        <w:rPr>
+          <w:rFonts w:ascii="Calibri" w:hAnsi="Calibri" w:cs="Calibri"/>
+          <w:b/>
+          <w:sz w:val="24"/>
+          <w:szCs w:val="24"/>
+        </w:rPr>
+        <w:tab/>
+        <w:t xml:space="preserve">  </w:t>
+      </w:r>
+      <w:r>
+        <w:rPr>
+          <w:rStyle w:val="Hyperlink"/>
+          <w:color w:val="auto"/>
+          <w:u w:val="none"/>
+        </w:rPr>
+        <w:t xml:space="preserve">       </w:t>
+      </w:r>
+      <w:proofErr w:type="gramStart"/>
+      <w:r>
+        <w:rPr>
+          <w:rStyle w:val="Hyperlink"/>
+          <w:color w:val="auto"/>
+          <w:u w:val="none"/>
+        </w:rPr>
+        <w:t xml:space="preserve">   </w:t>
+      </w:r>
+      <w:r>
+        <w:rPr>
+          <w:rStyle w:val="Hyperlink"/>
+          <w:rFonts w:ascii="Calibri" w:hAnsi="Calibri" w:cs="Calibri"/>
+          <w:color w:val="2F5496" w:themeColor="accent5" w:themeShade="BF"/>
+          <w:sz w:val="24"/>
+          <w:szCs w:val="24"/>
+          <w:u w:val="none"/>
+        </w:rPr>
+        <w:t>(</w:t>
+      </w:r>
+      <w:proofErr w:type="gramEnd"/>
       <w:hyperlink r:id="rId11" w:history="1">
         <w:r>
           <w:rPr>
@@ -1642,13 +3539,6 @@
           <w:u w:val="none"/>
         </w:rPr>
         <w:tab/>
-      </w:r>
-      <w:r>
-        <w:rPr>
-          <w:rStyle w:val="Hyperlink"/>
-          <w:color w:val="auto"/>
-          <w:u w:val="none"/>
-        </w:rPr>
         <w:t xml:space="preserve"> </w:t>
       </w:r>
       <w:r>
@@ -1658,7 +3548,43 @@
           <w:sz w:val="24"/>
           <w:szCs w:val="24"/>
         </w:rPr>
-        <w:t>03/2025-05/2025</w:t>
+        <w:t>12</w:t>
+      </w:r>
+      <w:r>
+        <w:rPr>
+          <w:rFonts w:ascii="Calibri" w:hAnsi="Calibri" w:cs="Calibri"/>
+          <w:b/>
+          <w:sz w:val="24"/>
+          <w:szCs w:val="24"/>
+        </w:rPr>
+        <w:t>/2025-</w:t>
+      </w:r>
+      <w:r>
+        <w:rPr>
+          <w:rFonts w:ascii="Calibri" w:hAnsi="Calibri" w:cs="Calibri"/>
+          <w:b/>
+          <w:sz w:val="24"/>
+          <w:szCs w:val="24"/>
+        </w:rPr>
+        <w:t>01</w:t>
+      </w:r>
+      <w:r>
+        <w:rPr>
+          <w:rFonts w:ascii="Calibri" w:hAnsi="Calibri" w:cs="Calibri"/>
+          <w:b/>
+          <w:sz w:val="24"/>
+          <w:szCs w:val="24"/>
+        </w:rPr>
+        <w:t>/202</w:t>
+      </w:r>
+      <w:r>
+        <w:rPr>
+          <w:rFonts w:ascii="Calibri" w:hAnsi="Calibri" w:cs="Calibri"/>
+          <w:b/>
+          <w:sz w:val="24"/>
+          <w:szCs w:val="24"/>
+        </w:rPr>
+        <w:t>6</w:t>
       </w:r>
     </w:p>
     <w:p>
@@ -1671,6 +3597,8 @@
         <w:spacing w:line="240" w:lineRule="auto"/>
         <w:rPr>
           <w:rFonts w:ascii="Calibri" w:hAnsi="Calibri" w:cs="Calibri"/>
+          <w:b/>
+          <w:bCs/>
           <w:sz w:val="24"/>
           <w:szCs w:val="24"/>
         </w:rPr>
@@ -1698,7 +3626,39 @@
           <w:sz w:val="24"/>
           <w:szCs w:val="24"/>
         </w:rPr>
-        <w:t>Developed a web-based admin panel to manage data for a mobile flashcard English learning application</w:t>
+        <w:t xml:space="preserve">Developed </w:t>
+      </w:r>
+      <w:r>
+        <w:rPr>
+          <w:rFonts w:ascii="Calibri" w:hAnsi="Calibri" w:cs="Calibri"/>
+          <w:sz w:val="24"/>
+          <w:szCs w:val="24"/>
+        </w:rPr>
+        <w:t>a</w:t>
+      </w:r>
+      <w:r>
+        <w:rPr>
+          <w:rFonts w:ascii="Calibri" w:hAnsi="Calibri" w:cs="Calibri"/>
+          <w:sz w:val="24"/>
+          <w:szCs w:val="24"/>
+        </w:rPr>
+        <w:t xml:space="preserve">n online Pomodoro Timer to boost </w:t>
+      </w:r>
+      <w:r>
+        <w:rPr>
+          <w:rFonts w:ascii="Calibri" w:hAnsi="Calibri" w:cs="Calibri"/>
+          <w:sz w:val="24"/>
+          <w:szCs w:val="24"/>
+        </w:rPr>
+        <w:t>the</w:t>
+      </w:r>
+      <w:r>
+        <w:rPr>
+          <w:rFonts w:ascii="Calibri" w:hAnsi="Calibri" w:cs="Calibri"/>
+          <w:sz w:val="24"/>
+          <w:szCs w:val="24"/>
+        </w:rPr>
+        <w:t xml:space="preserve"> productivity</w:t>
       </w:r>
       <w:r>
         <w:rPr>
@@ -1723,30 +3683,71 @@
           <w:szCs w:val="24"/>
         </w:rPr>
       </w:pPr>
-      <w:r>
-        <w:rPr>
-          <w:rFonts w:ascii="Calibri" w:hAnsi="Calibri" w:cs="Calibri"/>
-          <w:sz w:val="24"/>
-          <w:szCs w:val="24"/>
-        </w:rPr>
-        <w:t xml:space="preserve">Implemented </w:t>
-      </w:r>
-      <w:r>
-        <w:rPr>
-          <w:rFonts w:ascii="Calibri" w:hAnsi="Calibri" w:cs="Calibri"/>
+      <w:bookmarkStart w:id="5" w:name="_Hlk219147897"/>
+      <w:r>
+        <w:rPr>
+          <w:rFonts w:ascii="Calibri" w:hAnsi="Calibri" w:cs="Calibri"/>
+          <w:b/>
           <w:bCs/>
           <w:sz w:val="24"/>
           <w:szCs w:val="24"/>
         </w:rPr>
-        <w:t>CRUD</w:t>
-      </w:r>
-      <w:r>
-        <w:rPr>
-          <w:rFonts w:ascii="Calibri" w:hAnsi="Calibri" w:cs="Calibri"/>
-          <w:sz w:val="24"/>
-          <w:szCs w:val="24"/>
-        </w:rPr>
-        <w:t xml:space="preserve"> operations for core entities: Users, Flashcard Sets, and Flashcards.</w:t>
+        <w:t>Backend</w:t>
+      </w:r>
+      <w:r>
+        <w:rPr>
+          <w:rFonts w:ascii="Calibri" w:hAnsi="Calibri" w:cs="Calibri"/>
+          <w:sz w:val="24"/>
+          <w:szCs w:val="24"/>
+        </w:rPr>
+        <w:t xml:space="preserve"> </w:t>
+      </w:r>
+      <w:r>
+        <w:rPr>
+          <w:rFonts w:ascii="Calibri" w:hAnsi="Calibri" w:cs="Calibri"/>
+          <w:b/>
+          <w:bCs/>
+          <w:sz w:val="24"/>
+          <w:szCs w:val="24"/>
+        </w:rPr>
+        <w:t>&amp; Persistence</w:t>
+      </w:r>
+      <w:bookmarkEnd w:id="5"/>
+      <w:r>
+        <w:rPr>
+          <w:rFonts w:ascii="Calibri" w:hAnsi="Calibri" w:cs="Calibri"/>
+          <w:b/>
+          <w:bCs/>
+          <w:sz w:val="24"/>
+          <w:szCs w:val="24"/>
+        </w:rPr>
+        <w:t xml:space="preserve">: </w:t>
+      </w:r>
+      <w:r>
+        <w:rPr>
+          <w:rFonts w:ascii="Calibri" w:hAnsi="Calibri" w:cs="Calibri"/>
+          <w:sz w:val="24"/>
+          <w:szCs w:val="24"/>
+        </w:rPr>
+        <w:t xml:space="preserve">Developed backend services using </w:t>
+      </w:r>
+      <w:proofErr w:type="spellStart"/>
+      <w:r>
+        <w:rPr>
+          <w:rFonts w:ascii="Calibri" w:hAnsi="Calibri" w:cs="Calibri"/>
+          <w:sz w:val="24"/>
+          <w:szCs w:val="24"/>
+        </w:rPr>
+        <w:t>MyBatis</w:t>
+      </w:r>
+      <w:proofErr w:type="spellEnd"/>
+      <w:r>
+        <w:rPr>
+          <w:rFonts w:ascii="Calibri" w:hAnsi="Calibri" w:cs="Calibri"/>
+          <w:sz w:val="24"/>
+          <w:szCs w:val="24"/>
+        </w:rPr>
+        <w:t xml:space="preserve"> for efficient data fetching and transaction management.</w:t>
       </w:r>
     </w:p>
     <w:p>
@@ -1766,35 +3767,54 @@
       <w:r>
         <w:rPr>
           <w:rFonts w:ascii="Calibri" w:hAnsi="Calibri" w:cs="Calibri"/>
-          <w:sz w:val="24"/>
-          <w:szCs w:val="24"/>
-        </w:rPr>
-        <w:t xml:space="preserve">Secured the application using </w:t>
-      </w:r>
-      <w:r>
-        <w:rPr>
-          <w:rFonts w:ascii="Calibri" w:hAnsi="Calibri" w:cs="Calibri"/>
+          <w:b/>
           <w:bCs/>
           <w:sz w:val="24"/>
           <w:szCs w:val="24"/>
         </w:rPr>
-        <w:t>Spring Security</w:t>
-      </w:r>
-      <w:r>
-        <w:rPr>
-          <w:rFonts w:ascii="Calibri" w:hAnsi="Calibri" w:cs="Calibri"/>
-          <w:sz w:val="24"/>
-          <w:szCs w:val="24"/>
-        </w:rPr>
-        <w:t xml:space="preserve"> with role-based access control (Admin vs. User)</w:t>
-      </w:r>
-      <w:r>
-        <w:rPr>
-          <w:rFonts w:ascii="Calibri" w:hAnsi="Calibri" w:cs="Calibri"/>
-          <w:sz w:val="24"/>
-          <w:szCs w:val="24"/>
-        </w:rPr>
-        <w:t>.</w:t>
+        <w:t>Security</w:t>
+      </w:r>
+      <w:r>
+        <w:rPr>
+          <w:rFonts w:ascii="Calibri" w:hAnsi="Calibri" w:cs="Calibri"/>
+          <w:sz w:val="24"/>
+          <w:szCs w:val="24"/>
+        </w:rPr>
+        <w:t xml:space="preserve">: </w:t>
+      </w:r>
+      <w:r>
+        <w:rPr>
+          <w:rFonts w:ascii="Calibri" w:hAnsi="Calibri" w:cs="Calibri"/>
+          <w:sz w:val="24"/>
+          <w:szCs w:val="24"/>
+        </w:rPr>
+        <w:t>Used</w:t>
+      </w:r>
+      <w:r>
+        <w:rPr>
+          <w:rFonts w:ascii="Calibri" w:hAnsi="Calibri" w:cs="Calibri"/>
+          <w:sz w:val="24"/>
+          <w:szCs w:val="24"/>
+        </w:rPr>
+        <w:t xml:space="preserve"> Spring Security with JWT and OAuth2, managed secure state via </w:t>
+      </w:r>
+      <w:proofErr w:type="spellStart"/>
+      <w:r>
+        <w:rPr>
+          <w:rFonts w:ascii="Calibri" w:hAnsi="Calibri" w:cs="Calibri"/>
+          <w:sz w:val="24"/>
+          <w:szCs w:val="24"/>
+        </w:rPr>
+        <w:t>HttpOnly</w:t>
+      </w:r>
+      <w:proofErr w:type="spellEnd"/>
+      <w:r>
+        <w:rPr>
+          <w:rFonts w:ascii="Calibri" w:hAnsi="Calibri" w:cs="Calibri"/>
+          <w:sz w:val="24"/>
+          <w:szCs w:val="24"/>
+        </w:rPr>
+        <w:t xml:space="preserve"> Cookies.</w:t>
       </w:r>
     </w:p>
     <w:p>
@@ -1814,27 +3834,28 @@
       <w:r>
         <w:rPr>
           <w:rFonts w:ascii="Calibri" w:hAnsi="Calibri" w:cs="Calibri"/>
-          <w:sz w:val="24"/>
-          <w:szCs w:val="24"/>
-        </w:rPr>
-        <w:t xml:space="preserve">Designed and developed </w:t>
-      </w:r>
-      <w:r>
-        <w:rPr>
-          <w:rFonts w:ascii="Calibri" w:hAnsi="Calibri" w:cs="Calibri"/>
+          <w:b/>
           <w:bCs/>
           <w:sz w:val="24"/>
           <w:szCs w:val="24"/>
         </w:rPr>
-        <w:t>RESTful APIs</w:t>
-      </w:r>
-      <w:r>
-        <w:rPr>
-          <w:rFonts w:ascii="Calibri" w:hAnsi="Calibri" w:cs="Calibri"/>
-          <w:sz w:val="24"/>
-          <w:szCs w:val="24"/>
-        </w:rPr>
-        <w:t xml:space="preserve"> to enable the mobile app to retrieve and sync data.</w:t>
+        <w:t>Frontend</w:t>
+      </w:r>
+      <w:r>
+        <w:rPr>
+          <w:rFonts w:ascii="Calibri" w:hAnsi="Calibri" w:cs="Calibri"/>
+          <w:sz w:val="24"/>
+          <w:szCs w:val="24"/>
+        </w:rPr>
+        <w:t>:</w:t>
+      </w:r>
+      <w:r>
+        <w:rPr>
+          <w:rFonts w:ascii="Calibri" w:hAnsi="Calibri" w:cs="Calibri"/>
+          <w:sz w:val="24"/>
+          <w:szCs w:val="24"/>
+        </w:rPr>
+        <w:t xml:space="preserve"> Architected a fast-loading frontend using Vite and ReactJS, implementing routing with React Router and professional UI using MUI.</w:t>
       </w:r>
     </w:p>
     <w:p>
@@ -1854,27 +3875,20 @@
       <w:r>
         <w:rPr>
           <w:rFonts w:ascii="Calibri" w:hAnsi="Calibri" w:cs="Calibri"/>
-          <w:sz w:val="24"/>
-          <w:szCs w:val="24"/>
-        </w:rPr>
-        <w:t xml:space="preserve">Deployed the application to </w:t>
-      </w:r>
-      <w:r>
-        <w:rPr>
-          <w:rFonts w:ascii="Calibri" w:hAnsi="Calibri" w:cs="Calibri"/>
+          <w:b/>
           <w:bCs/>
           <w:sz w:val="24"/>
           <w:szCs w:val="24"/>
         </w:rPr>
-        <w:t>AWS</w:t>
-      </w:r>
-      <w:r>
-        <w:rPr>
-          <w:rFonts w:ascii="Calibri" w:hAnsi="Calibri" w:cs="Calibri"/>
-          <w:sz w:val="24"/>
-          <w:szCs w:val="24"/>
-        </w:rPr>
-        <w:t xml:space="preserve"> for production environment hosting and availability.</w:t>
+        <w:t>Containerization</w:t>
+      </w:r>
+      <w:r>
+        <w:rPr>
+          <w:rFonts w:ascii="Calibri" w:hAnsi="Calibri" w:cs="Calibri"/>
+          <w:sz w:val="24"/>
+          <w:szCs w:val="24"/>
+        </w:rPr>
+        <w:t>: Deployment cycles with Docker.</w:t>
       </w:r>
     </w:p>
     <w:p>
@@ -1906,377 +3920,27 @@
           <w:sz w:val="24"/>
           <w:szCs w:val="24"/>
         </w:rPr>
-        <w:t>:</w:t>
-      </w:r>
-      <w:r>
-        <w:rPr>
-          <w:rFonts w:ascii="Calibri" w:hAnsi="Calibri" w:cs="Calibri"/>
-          <w:sz w:val="24"/>
-          <w:szCs w:val="24"/>
-        </w:rPr>
-        <w:t xml:space="preserve"> </w:t>
-      </w:r>
-      <w:r>
-        <w:rPr>
-          <w:rFonts w:ascii="Calibri" w:hAnsi="Calibri" w:cs="Calibri"/>
-          <w:sz w:val="24"/>
-          <w:szCs w:val="24"/>
-        </w:rPr>
-        <w:t>Spring Boot, Spring Security, Spring Data JPA, Hibernate, RESTful API, HTML5, CSS3, JavaScript, Bootstrap, Thymeleaf, MySQL, AWS Server</w:t>
-      </w:r>
-      <w:r>
-        <w:rPr>
-          <w:rFonts w:ascii="Calibri" w:hAnsi="Calibri" w:cs="Calibri"/>
-          <w:sz w:val="24"/>
-          <w:szCs w:val="24"/>
-        </w:rPr>
-        <w:t>, Git, GitH</w:t>
-      </w:r>
-      <w:r>
-        <w:rPr>
-          <w:rFonts w:ascii="Calibri" w:hAnsi="Calibri" w:cs="Calibri"/>
-          <w:sz w:val="24"/>
-          <w:szCs w:val="24"/>
-        </w:rPr>
-        <w:t>ub.</w:t>
-      </w:r>
-      <w:r>
-        <w:rPr>
-          <w:rFonts w:ascii="Calibri" w:hAnsi="Calibri" w:cs="Calibri"/>
-          <w:sz w:val="24"/>
-          <w:szCs w:val="24"/>
-        </w:rPr>
-        <w:t xml:space="preserve"> </w:t>
-      </w:r>
-    </w:p>
-    <w:p>
-      <w:pPr>
-        <w:spacing w:line="240" w:lineRule="auto"/>
-        <w:rPr>
-          <w:rStyle w:val="Hyperlink"/>
-          <w:color w:val="auto"/>
-          <w:u w:val="none"/>
-        </w:rPr>
-      </w:pPr>
-      <w:r>
-        <w:rPr>
-          <w:rFonts w:ascii="Calibri" w:hAnsi="Calibri" w:cs="Calibri"/>
-          <w:b/>
-          <w:sz w:val="24"/>
-          <w:szCs w:val="24"/>
-        </w:rPr>
-        <w:t xml:space="preserve">Project: </w:t>
-      </w:r>
-      <w:r>
-        <w:rPr>
-          <w:rFonts w:ascii="Calibri" w:hAnsi="Calibri" w:cs="Calibri"/>
-          <w:sz w:val="24"/>
-          <w:szCs w:val="24"/>
-        </w:rPr>
-        <w:t>Flash Card</w:t>
-      </w:r>
-      <w:r>
-        <w:rPr>
-          <w:rFonts w:ascii="Calibri" w:hAnsi="Calibri" w:cs="Calibri"/>
-          <w:sz w:val="24"/>
-          <w:szCs w:val="24"/>
-        </w:rPr>
-        <w:t xml:space="preserve"> Android App</w:t>
-      </w:r>
-      <w:r>
-        <w:rPr>
-          <w:rFonts w:ascii="Calibri" w:hAnsi="Calibri" w:cs="Calibri"/>
-          <w:b/>
-          <w:sz w:val="24"/>
-          <w:szCs w:val="24"/>
-        </w:rPr>
-        <w:t xml:space="preserve">                           </w:t>
-      </w:r>
-      <w:r>
-        <w:rPr>
-          <w:rStyle w:val="Hyperlink"/>
-          <w:rFonts w:ascii="Calibri" w:hAnsi="Calibri" w:cs="Calibri"/>
-          <w:color w:val="2F5496" w:themeColor="accent5" w:themeShade="BF"/>
-          <w:sz w:val="24"/>
-          <w:szCs w:val="24"/>
-          <w:u w:val="none"/>
-        </w:rPr>
-        <w:t>(</w:t>
-      </w:r>
-      <w:hyperlink r:id="rId12" w:history="1">
-        <w:r>
-          <w:rPr>
-            <w:rStyle w:val="Hyperlink"/>
-            <w:rFonts w:ascii="Calibri" w:hAnsi="Calibri" w:cs="Calibri"/>
-            <w:color w:val="2F5496" w:themeColor="accent5" w:themeShade="BF"/>
-            <w:sz w:val="24"/>
-            <w:szCs w:val="24"/>
-            <w:u w:val="none"/>
-          </w:rPr>
-          <w:t>Check here</w:t>
-        </w:r>
-      </w:hyperlink>
-      <w:r>
-        <w:rPr>
-          <w:rStyle w:val="Hyperlink"/>
-          <w:rFonts w:ascii="Calibri" w:hAnsi="Calibri" w:cs="Calibri"/>
-          <w:color w:val="2F5496" w:themeColor="accent5" w:themeShade="BF"/>
-          <w:sz w:val="24"/>
-          <w:szCs w:val="24"/>
-          <w:u w:val="none"/>
-        </w:rPr>
-        <w:t>)</w:t>
-      </w:r>
-      <w:r>
-        <w:rPr>
-          <w:rStyle w:val="Hyperlink"/>
-          <w:color w:val="auto"/>
-          <w:u w:val="none"/>
-        </w:rPr>
-        <w:t xml:space="preserve">  </w:t>
-      </w:r>
-      <w:r>
-        <w:rPr>
-          <w:rStyle w:val="Hyperlink"/>
-          <w:color w:val="auto"/>
-          <w:u w:val="none"/>
-        </w:rPr>
-        <w:tab/>
-      </w:r>
-      <w:r>
-        <w:rPr>
-          <w:rStyle w:val="Hyperlink"/>
-          <w:color w:val="auto"/>
-          <w:u w:val="none"/>
-        </w:rPr>
-        <w:tab/>
-        <w:t xml:space="preserve"> </w:t>
-      </w:r>
-      <w:r>
-        <w:rPr>
-          <w:rFonts w:ascii="Calibri" w:hAnsi="Calibri" w:cs="Calibri"/>
-          <w:b/>
-          <w:sz w:val="24"/>
-          <w:szCs w:val="24"/>
-        </w:rPr>
-        <w:t>03/2025-05/2025</w:t>
-      </w:r>
-    </w:p>
-    <w:p>
-      <w:pPr>
-        <w:pStyle w:val="ListParagraph"/>
-        <w:numPr>
-          <w:ilvl w:val="0"/>
-          <w:numId w:val="1"/>
-        </w:numPr>
-        <w:spacing w:line="240" w:lineRule="auto"/>
-        <w:rPr>
-          <w:rFonts w:ascii="Calibri" w:hAnsi="Calibri" w:cs="Calibri"/>
-          <w:sz w:val="24"/>
-          <w:szCs w:val="24"/>
-        </w:rPr>
-      </w:pPr>
-      <w:r>
-        <w:rPr>
-          <w:rFonts w:ascii="Calibri" w:hAnsi="Calibri" w:cs="Calibri"/>
-          <w:b/>
-          <w:sz w:val="24"/>
-          <w:szCs w:val="24"/>
-        </w:rPr>
-        <w:t>Description</w:t>
-      </w:r>
-      <w:r>
-        <w:rPr>
-          <w:rFonts w:ascii="Calibri" w:hAnsi="Calibri" w:cs="Calibri"/>
-          <w:sz w:val="24"/>
-          <w:szCs w:val="24"/>
-        </w:rPr>
         <w:t xml:space="preserve">: </w:t>
       </w:r>
-      <w:r>
-        <w:rPr>
-          <w:rFonts w:ascii="Calibri" w:hAnsi="Calibri" w:cs="Calibri"/>
-          <w:sz w:val="24"/>
-          <w:szCs w:val="24"/>
-        </w:rPr>
-        <w:t>Developed an Android application to help users learn English vocabulary using the flashcard method.</w:t>
-      </w:r>
-    </w:p>
-    <w:p>
-      <w:pPr>
-        <w:pStyle w:val="ListParagraph"/>
-        <w:numPr>
-          <w:ilvl w:val="1"/>
-          <w:numId w:val="4"/>
-        </w:numPr>
-        <w:spacing w:line="240" w:lineRule="auto"/>
-        <w:rPr>
-          <w:rFonts w:ascii="Calibri" w:hAnsi="Calibri" w:cs="Calibri"/>
-          <w:sz w:val="24"/>
-          <w:szCs w:val="24"/>
-        </w:rPr>
-      </w:pPr>
-      <w:r>
-        <w:rPr>
-          <w:rFonts w:ascii="Calibri" w:hAnsi="Calibri" w:cs="Calibri"/>
-          <w:sz w:val="24"/>
-          <w:szCs w:val="24"/>
-        </w:rPr>
-        <w:t>Create</w:t>
-      </w:r>
-      <w:bookmarkStart w:id="0" w:name="_GoBack"/>
-      <w:bookmarkEnd w:id="0"/>
-      <w:r>
-        <w:rPr>
-          <w:rFonts w:ascii="Calibri" w:hAnsi="Calibri" w:cs="Calibri"/>
-          <w:sz w:val="24"/>
-          <w:szCs w:val="24"/>
-        </w:rPr>
-        <w:t>, edit, delete, and manage personal vocabulary flashcard sets.</w:t>
-      </w:r>
-    </w:p>
-    <w:p>
-      <w:pPr>
-        <w:pStyle w:val="ListParagraph"/>
-        <w:numPr>
-          <w:ilvl w:val="1"/>
-          <w:numId w:val="4"/>
-        </w:numPr>
-        <w:spacing w:line="240" w:lineRule="auto"/>
-        <w:rPr>
-          <w:rFonts w:ascii="Calibri" w:hAnsi="Calibri" w:cs="Calibri"/>
-          <w:sz w:val="24"/>
-          <w:szCs w:val="24"/>
-        </w:rPr>
-      </w:pPr>
-      <w:r>
-        <w:rPr>
-          <w:rFonts w:ascii="Calibri" w:hAnsi="Calibri" w:cs="Calibri"/>
-          <w:sz w:val="24"/>
-          <w:szCs w:val="24"/>
-        </w:rPr>
-        <w:t>Display words and meanings in flashcard format with flip functionality for self-testing.</w:t>
-      </w:r>
-    </w:p>
-    <w:p>
-      <w:pPr>
-        <w:pStyle w:val="ListParagraph"/>
-        <w:numPr>
-          <w:ilvl w:val="1"/>
-          <w:numId w:val="4"/>
-        </w:numPr>
-        <w:spacing w:line="240" w:lineRule="auto"/>
-        <w:rPr>
-          <w:rFonts w:ascii="Calibri" w:hAnsi="Calibri" w:cs="Calibri"/>
-          <w:sz w:val="24"/>
-          <w:szCs w:val="24"/>
-        </w:rPr>
-      </w:pPr>
-      <w:r>
-        <w:rPr>
-          <w:rFonts w:ascii="Calibri" w:hAnsi="Calibri" w:cs="Calibri"/>
-          <w:sz w:val="24"/>
-          <w:szCs w:val="24"/>
-        </w:rPr>
-        <w:t>Review mode with both multiple-choice and written-answer quizzes.</w:t>
-      </w:r>
-    </w:p>
-    <w:p>
-      <w:pPr>
-        <w:pStyle w:val="ListParagraph"/>
-        <w:numPr>
-          <w:ilvl w:val="1"/>
-          <w:numId w:val="4"/>
-        </w:numPr>
-        <w:spacing w:line="240" w:lineRule="auto"/>
-        <w:rPr>
-          <w:rFonts w:ascii="Calibri" w:hAnsi="Calibri" w:cs="Calibri"/>
-          <w:sz w:val="24"/>
-          <w:szCs w:val="24"/>
-        </w:rPr>
-      </w:pPr>
-      <w:r>
-        <w:rPr>
-          <w:rFonts w:ascii="Calibri" w:hAnsi="Calibri" w:cs="Calibri"/>
-          <w:sz w:val="24"/>
-          <w:szCs w:val="24"/>
-        </w:rPr>
-        <w:t xml:space="preserve">Synchronize data with the server via </w:t>
-      </w:r>
-      <w:r>
-        <w:rPr>
-          <w:rFonts w:ascii="Calibri" w:hAnsi="Calibri" w:cs="Calibri"/>
-          <w:bCs/>
-          <w:sz w:val="24"/>
-          <w:szCs w:val="24"/>
-        </w:rPr>
-        <w:t>RESTful API</w:t>
-      </w:r>
-      <w:r>
-        <w:rPr>
-          <w:rFonts w:ascii="Calibri" w:hAnsi="Calibri" w:cs="Calibri"/>
-          <w:sz w:val="24"/>
-          <w:szCs w:val="24"/>
-        </w:rPr>
-        <w:t xml:space="preserve"> using </w:t>
-      </w:r>
-      <w:r>
-        <w:rPr>
-          <w:rFonts w:ascii="Calibri" w:hAnsi="Calibri" w:cs="Calibri"/>
-          <w:bCs/>
-          <w:sz w:val="24"/>
-          <w:szCs w:val="24"/>
-        </w:rPr>
-        <w:t>Retrofit</w:t>
-      </w:r>
-      <w:r>
-        <w:rPr>
-          <w:rFonts w:ascii="Calibri" w:hAnsi="Calibri" w:cs="Calibri"/>
-          <w:sz w:val="24"/>
-          <w:szCs w:val="24"/>
-        </w:rPr>
-        <w:t>.</w:t>
-      </w:r>
-    </w:p>
-    <w:p>
-      <w:pPr>
-        <w:pStyle w:val="ListParagraph"/>
-        <w:numPr>
-          <w:ilvl w:val="0"/>
-          <w:numId w:val="1"/>
-        </w:numPr>
-        <w:spacing w:line="240" w:lineRule="auto"/>
-        <w:rPr>
-          <w:rFonts w:ascii="Calibri" w:hAnsi="Calibri" w:cs="Calibri"/>
-          <w:sz w:val="24"/>
-          <w:szCs w:val="24"/>
-        </w:rPr>
-      </w:pPr>
-      <w:r>
-        <w:rPr>
-          <w:rFonts w:ascii="Calibri" w:hAnsi="Calibri" w:cs="Calibri"/>
-          <w:b/>
-          <w:sz w:val="24"/>
-          <w:szCs w:val="24"/>
-        </w:rPr>
-        <w:t>Technologies</w:t>
-      </w:r>
-      <w:r>
-        <w:rPr>
-          <w:rFonts w:ascii="Calibri" w:hAnsi="Calibri" w:cs="Calibri"/>
-          <w:sz w:val="24"/>
-          <w:szCs w:val="24"/>
-        </w:rPr>
-        <w:t xml:space="preserve">: </w:t>
-      </w:r>
-      <w:r>
-        <w:rPr>
-          <w:rFonts w:ascii="Calibri" w:hAnsi="Calibri" w:cs="Calibri"/>
-          <w:sz w:val="24"/>
-          <w:szCs w:val="24"/>
-        </w:rPr>
-        <w:t>Java</w:t>
-      </w:r>
+      <w:bookmarkStart w:id="6" w:name="_Hlk219147915"/>
+      <w:r>
+        <w:rPr>
+          <w:rFonts w:ascii="Calibri" w:hAnsi="Calibri" w:cs="Calibri"/>
+          <w:sz w:val="24"/>
+          <w:szCs w:val="24"/>
+        </w:rPr>
+        <w:t xml:space="preserve">Spring Boot, Spring Security, </w:t>
+      </w:r>
+      <w:proofErr w:type="spellStart"/>
+      <w:r>
+        <w:rPr>
+          <w:rFonts w:ascii="Calibri" w:hAnsi="Calibri" w:cs="Calibri"/>
+          <w:sz w:val="24"/>
+          <w:szCs w:val="24"/>
+        </w:rPr>
+        <w:t>MyBatis</w:t>
+      </w:r>
+      <w:proofErr w:type="spellEnd"/>
       <w:r>
         <w:rPr>
           <w:rFonts w:ascii="Calibri" w:hAnsi="Calibri" w:cs="Calibri"/>
@@ -2291,24 +3955,9 @@
           <w:sz w:val="24"/>
           <w:szCs w:val="24"/>
         </w:rPr>
-        <w:t xml:space="preserve">Android Jetpack, MySQL, Retrofit, </w:t>
-      </w:r>
-      <w:r>
-        <w:rPr>
-          <w:rFonts w:ascii="Calibri" w:hAnsi="Calibri" w:cs="Calibri"/>
-          <w:sz w:val="24"/>
-          <w:szCs w:val="24"/>
-        </w:rPr>
-        <w:t xml:space="preserve">Android </w:t>
-      </w:r>
-      <w:r>
-        <w:rPr>
-          <w:rFonts w:ascii="Calibri" w:hAnsi="Calibri" w:cs="Calibri"/>
-          <w:sz w:val="24"/>
-          <w:szCs w:val="24"/>
-        </w:rPr>
-        <w:t>UI, Git, GitHub.</w:t>
-      </w:r>
+        <w:t>JWT, OAuth2, ReactJS, Vite, Material UI, React Router, Axios, MySQL, Docker, Git, GitHub, Cookie-based Authentication.</w:t>
+      </w:r>
+      <w:bookmarkEnd w:id="6"/>
     </w:p>
     <w:p>
       <w:pPr>
@@ -2580,7 +4229,7 @@
               </w:rPr>
               <w:t>(</w:t>
             </w:r>
-            <w:hyperlink r:id="rId13" w:history="1">
+            <w:hyperlink r:id="rId12" w:history="1">
               <w:r>
                 <w:rPr>
                   <w:rStyle w:val="Hyperlink"/>
@@ -2674,7 +4323,7 @@
 </file>
 
 <file path=word/endnotes.xml><?xml version="1.0" encoding="utf-8"?>
-<w:endnotes xmlns:wpc="http://schemas.microsoft.com/office/word/2010/wordprocessingCanvas" xmlns:cx="http://schemas.microsoft.com/office/drawing/2014/chartex" xmlns:mc="http://schemas.openxmlformats.org/markup-compatibility/2006" xmlns:o="urn:schemas-microsoft-com:office:office" xmlns:r="http://schemas.openxmlformats.org/officeDocument/2006/relationships" xmlns:m="http://schemas.openxmlformats.org/officeDocument/2006/math" xmlns:v="urn:schemas-microsoft-com:vml" xmlns:wp14="http://schemas.microsoft.com/office/word/2010/wordprocessingDrawing" xmlns:wp="http://schemas.openxmlformats.org/drawingml/2006/wordprocessingDrawing" xmlns:w10="urn:schemas-microsoft-com:office:word" xmlns:w="http://schemas.openxmlformats.org/wordprocessingml/2006/main" xmlns:w14="http://schemas.microsoft.com/office/word/2010/wordml" xmlns:w15="http://schemas.microsoft.com/office/word/2012/wordml" xmlns:w16se="http://schemas.microsoft.com/office/word/2015/wordml/symex" xmlns:wpg="http://schemas.microsoft.com/office/word/2010/wordprocessingGroup" xmlns:wpi="http://schemas.microsoft.com/office/word/2010/wordprocessingInk" xmlns:wne="http://schemas.microsoft.com/office/word/2006/wordml" xmlns:wps="http://schemas.microsoft.com/office/word/2010/wordprocessingShape" mc:Ignorable="w14 w15 w16se wp14">
+<w:endnotes xmlns:wpc="http://schemas.microsoft.com/office/word/2010/wordprocessingCanvas" xmlns:cx="http://schemas.microsoft.com/office/drawing/2014/chartex" xmlns:cx1="http://schemas.microsoft.com/office/drawing/2015/9/8/chartex" xmlns:cx2="http://schemas.microsoft.com/office/drawing/2015/10/21/chartex" xmlns:cx3="http://schemas.microsoft.com/office/drawing/2016/5/9/chartex" xmlns:cx4="http://schemas.microsoft.com/office/drawing/2016/5/10/chartex" xmlns:cx5="http://schemas.microsoft.com/office/drawing/2016/5/11/chartex" xmlns:cx6="http://schemas.microsoft.com/office/drawing/2016/5/12/chartex" xmlns:cx7="http://schemas.microsoft.com/office/drawing/2016/5/13/chartex" xmlns:cx8="http://schemas.microsoft.com/office/drawing/2016/5/14/chartex" xmlns:mc="http://schemas.openxmlformats.org/markup-compatibility/2006" xmlns:aink="http://schemas.microsoft.com/office/drawing/2016/ink" xmlns:am3d="http://schemas.microsoft.com/office/drawing/2017/model3d" xmlns:o="urn:schemas-microsoft-com:office:office" xmlns:oel="http://schemas.microsoft.com/office/2019/extlst" xmlns:r="http://schemas.openxmlformats.org/officeDocument/2006/relationships" xmlns:m="http://schemas.openxmlformats.org/officeDocument/2006/math" xmlns:v="urn:schemas-microsoft-com:vml" xmlns:wp14="http://schemas.microsoft.com/office/word/2010/wordprocessingDrawing" xmlns:wp="http://schemas.openxmlformats.org/drawingml/2006/wordprocessingDrawing" xmlns:w10="urn:schemas-microsoft-com:office:word" xmlns:w="http://schemas.openxmlformats.org/wordprocessingml/2006/main" xmlns:w14="http://schemas.microsoft.com/office/word/2010/wordml" xmlns:w15="http://schemas.microsoft.com/office/word/2012/wordml" xmlns:w16cex="http://schemas.microsoft.com/office/word/2018/wordml/cex" xmlns:w16cid="http://schemas.microsoft.com/office/word/2016/wordml/cid" xmlns:w16="http://schemas.microsoft.com/office/word/2018/wordml" xmlns:w16du="http://schemas.microsoft.com/office/word/2023/wordml/word16du" xmlns:w16sdtdh="http://schemas.microsoft.com/office/word/2020/wordml/sdtdatahash" xmlns:w16sdtfl="http://schemas.microsoft.com/office/word/2024/wordml/sdtformatlock" xmlns:w16se="http://schemas.microsoft.com/office/word/2015/wordml/symex" xmlns:wpg="http://schemas.microsoft.com/office/word/2010/wordprocessingGroup" xmlns:wpi="http://schemas.microsoft.com/office/word/2010/wordprocessingInk" xmlns:wne="http://schemas.microsoft.com/office/word/2006/wordml" xmlns:wps="http://schemas.microsoft.com/office/word/2010/wordprocessingShape" mc:Ignorable="w14 w15 w16se w16cid w16 w16cex w16sdtdh w16sdtfl w16du wp14">
   <w:endnote w:type="separator" w:id="-1">
     <w:p>
       <w:pPr>
@@ -2699,7 +4348,7 @@
 </file>
 
 <file path=word/footnotes.xml><?xml version="1.0" encoding="utf-8"?>
-<w:footnotes xmlns:wpc="http://schemas.microsoft.com/office/word/2010/wordprocessingCanvas" xmlns:cx="http://schemas.microsoft.com/office/drawing/2014/chartex" xmlns:mc="http://schemas.openxmlformats.org/markup-compatibility/2006" xmlns:o="urn:schemas-microsoft-com:office:office" xmlns:r="http://schemas.openxmlformats.org/officeDocument/2006/relationships" xmlns:m="http://schemas.openxmlformats.org/officeDocument/2006/math" xmlns:v="urn:schemas-microsoft-com:vml" xmlns:wp14="http://schemas.microsoft.com/office/word/2010/wordprocessingDrawing" xmlns:wp="http://schemas.openxmlformats.org/drawingml/2006/wordprocessingDrawing" xmlns:w10="urn:schemas-microsoft-com:office:word" xmlns:w="http://schemas.openxmlformats.org/wordprocessingml/2006/main" xmlns:w14="http://schemas.microsoft.com/office/word/2010/wordml" xmlns:w15="http://schemas.microsoft.com/office/word/2012/wordml" xmlns:w16se="http://schemas.microsoft.com/office/word/2015/wordml/symex" xmlns:wpg="http://schemas.microsoft.com/office/word/2010/wordprocessingGroup" xmlns:wpi="http://schemas.microsoft.com/office/word/2010/wordprocessingInk" xmlns:wne="http://schemas.microsoft.com/office/word/2006/wordml" xmlns:wps="http://schemas.microsoft.com/office/word/2010/wordprocessingShape" mc:Ignorable="w14 w15 w16se wp14">
+<w:footnotes xmlns:wpc="http://schemas.microsoft.com/office/word/2010/wordprocessingCanvas" xmlns:cx="http://schemas.microsoft.com/office/drawing/2014/chartex" xmlns:cx1="http://schemas.microsoft.com/office/drawing/2015/9/8/chartex" xmlns:cx2="http://schemas.microsoft.com/office/drawing/2015/10/21/chartex" xmlns:cx3="http://schemas.microsoft.com/office/drawing/2016/5/9/chartex" xmlns:cx4="http://schemas.microsoft.com/office/drawing/2016/5/10/chartex" xmlns:cx5="http://schemas.microsoft.com/office/drawing/2016/5/11/chartex" xmlns:cx6="http://schemas.microsoft.com/office/drawing/2016/5/12/chartex" xmlns:cx7="http://schemas.microsoft.com/office/drawing/2016/5/13/chartex" xmlns:cx8="http://schemas.microsoft.com/office/drawing/2016/5/14/chartex" xmlns:mc="http://schemas.openxmlformats.org/markup-compatibility/2006" xmlns:aink="http://schemas.microsoft.com/office/drawing/2016/ink" xmlns:am3d="http://schemas.microsoft.com/office/drawing/2017/model3d" xmlns:o="urn:schemas-microsoft-com:office:office" xmlns:oel="http://schemas.microsoft.com/office/2019/extlst" xmlns:r="http://schemas.openxmlformats.org/officeDocument/2006/relationships" xmlns:m="http://schemas.openxmlformats.org/officeDocument/2006/math" xmlns:v="urn:schemas-microsoft-com:vml" xmlns:wp14="http://schemas.microsoft.com/office/word/2010/wordprocessingDrawing" xmlns:wp="http://schemas.openxmlformats.org/drawingml/2006/wordprocessingDrawing" xmlns:w10="urn:schemas-microsoft-com:office:word" xmlns:w="http://schemas.openxmlformats.org/wordprocessingml/2006/main" xmlns:w14="http://schemas.microsoft.com/office/word/2010/wordml" xmlns:w15="http://schemas.microsoft.com/office/word/2012/wordml" xmlns:w16cex="http://schemas.microsoft.com/office/word/2018/wordml/cex" xmlns:w16cid="http://schemas.microsoft.com/office/word/2016/wordml/cid" xmlns:w16="http://schemas.microsoft.com/office/word/2018/wordml" xmlns:w16du="http://schemas.microsoft.com/office/word/2023/wordml/word16du" xmlns:w16sdtdh="http://schemas.microsoft.com/office/word/2020/wordml/sdtdatahash" xmlns:w16sdtfl="http://schemas.microsoft.com/office/word/2024/wordml/sdtformatlock" xmlns:w16se="http://schemas.microsoft.com/office/word/2015/wordml/symex" xmlns:wpg="http://schemas.microsoft.com/office/word/2010/wordprocessingGroup" xmlns:wpi="http://schemas.microsoft.com/office/word/2010/wordprocessingInk" xmlns:wne="http://schemas.microsoft.com/office/word/2006/wordml" xmlns:wps="http://schemas.microsoft.com/office/word/2010/wordprocessingShape" mc:Ignorable="w14 w15 w16se w16cid w16 w16cex w16sdtdh w16sdtfl w16du wp14">
   <w:footnote w:type="separator" w:id="-1">
     <w:p>
       <w:pPr>
@@ -2724,7 +4373,7 @@
 </file>
 
 <file path=word/numbering.xml><?xml version="1.0" encoding="utf-8"?>
-<w:numbering xmlns:wpc="http://schemas.microsoft.com/office/word/2010/wordprocessingCanvas" xmlns:cx="http://schemas.microsoft.com/office/drawing/2014/chartex" xmlns:mc="http://schemas.openxmlformats.org/markup-compatibility/2006" xmlns:o="urn:schemas-microsoft-com:office:office" xmlns:r="http://schemas.openxmlformats.org/officeDocument/2006/relationships" xmlns:m="http://schemas.openxmlformats.org/officeDocument/2006/math" xmlns:v="urn:schemas-microsoft-com:vml" xmlns:wp14="http://schemas.microsoft.com/office/word/2010/wordprocessingDrawing" xmlns:wp="http://schemas.openxmlformats.org/drawingml/2006/wordprocessingDrawing" xmlns:w10="urn:schemas-microsoft-com:office:word" xmlns:w="http://schemas.openxmlformats.org/wordprocessingml/2006/main" xmlns:w14="http://schemas.microsoft.com/office/word/2010/wordml" xmlns:w15="http://schemas.microsoft.com/office/word/2012/wordml" xmlns:w16se="http://schemas.microsoft.com/office/word/2015/wordml/symex" xmlns:wpg="http://schemas.microsoft.com/office/word/2010/wordprocessingGroup" xmlns:wpi="http://schemas.microsoft.com/office/word/2010/wordprocessingInk" xmlns:wne="http://schemas.microsoft.com/office/word/2006/wordml" xmlns:wps="http://schemas.microsoft.com/office/word/2010/wordprocessingShape" mc:Ignorable="w14 w15 w16se wp14">
+<w:numbering xmlns:wpc="http://schemas.microsoft.com/office/word/2010/wordprocessingCanvas" xmlns:cx="http://schemas.microsoft.com/office/drawing/2014/chartex" xmlns:cx1="http://schemas.microsoft.com/office/drawing/2015/9/8/chartex" xmlns:cx2="http://schemas.microsoft.com/office/drawing/2015/10/21/chartex" xmlns:cx3="http://schemas.microsoft.com/office/drawing/2016/5/9/chartex" xmlns:cx4="http://schemas.microsoft.com/office/drawing/2016/5/10/chartex" xmlns:cx5="http://schemas.microsoft.com/office/drawing/2016/5/11/chartex" xmlns:cx6="http://schemas.microsoft.com/office/drawing/2016/5/12/chartex" xmlns:cx7="http://schemas.microsoft.com/office/drawing/2016/5/13/chartex" xmlns:cx8="http://schemas.microsoft.com/office/drawing/2016/5/14/chartex" xmlns:mc="http://schemas.openxmlformats.org/markup-compatibility/2006" xmlns:aink="http://schemas.microsoft.com/office/drawing/2016/ink" xmlns:am3d="http://schemas.microsoft.com/office/drawing/2017/model3d" xmlns:o="urn:schemas-microsoft-com:office:office" xmlns:oel="http://schemas.microsoft.com/office/2019/extlst" xmlns:r="http://schemas.openxmlformats.org/officeDocument/2006/relationships" xmlns:m="http://schemas.openxmlformats.org/officeDocument/2006/math" xmlns:v="urn:schemas-microsoft-com:vml" xmlns:wp14="http://schemas.microsoft.com/office/word/2010/wordprocessingDrawing" xmlns:wp="http://schemas.openxmlformats.org/drawingml/2006/wordprocessingDrawing" xmlns:w10="urn:schemas-microsoft-com:office:word" xmlns:w="http://schemas.openxmlformats.org/wordprocessingml/2006/main" xmlns:w14="http://schemas.microsoft.com/office/word/2010/wordml" xmlns:w15="http://schemas.microsoft.com/office/word/2012/wordml" xmlns:w16cex="http://schemas.microsoft.com/office/word/2018/wordml/cex" xmlns:w16cid="http://schemas.microsoft.com/office/word/2016/wordml/cid" xmlns:w16="http://schemas.microsoft.com/office/word/2018/wordml" xmlns:w16du="http://schemas.microsoft.com/office/word/2023/wordml/word16du" xmlns:w16sdtdh="http://schemas.microsoft.com/office/word/2020/wordml/sdtdatahash" xmlns:w16sdtfl="http://schemas.microsoft.com/office/word/2024/wordml/sdtformatlock" xmlns:w16se="http://schemas.microsoft.com/office/word/2015/wordml/symex" xmlns:wpg="http://schemas.microsoft.com/office/word/2010/wordprocessingGroup" xmlns:wpi="http://schemas.microsoft.com/office/word/2010/wordprocessingInk" xmlns:wne="http://schemas.microsoft.com/office/word/2006/wordml" xmlns:wps="http://schemas.microsoft.com/office/word/2010/wordprocessingShape" mc:Ignorable="w14 w15 w16se w16cid w16 w16cex w16sdtdh w16sdtfl w16du wp14">
   <w:abstractNum w:abstractNumId="0" w15:restartNumberingAfterBreak="0">
     <w:nsid w:val="086119EC"/>
     <w:multiLevelType w:val="hybridMultilevel"/>
@@ -3290,26 +4939,26 @@
       </w:rPr>
     </w:lvl>
   </w:abstractNum>
-  <w:num w:numId="1">
+  <w:num w:numId="1" w16cid:durableId="1879387331">
     <w:abstractNumId w:val="1"/>
   </w:num>
-  <w:num w:numId="2">
+  <w:num w:numId="2" w16cid:durableId="1701472480">
     <w:abstractNumId w:val="0"/>
   </w:num>
-  <w:num w:numId="3">
+  <w:num w:numId="3" w16cid:durableId="327371399">
     <w:abstractNumId w:val="3"/>
   </w:num>
-  <w:num w:numId="4">
+  <w:num w:numId="4" w16cid:durableId="1481732865">
     <w:abstractNumId w:val="2"/>
   </w:num>
-  <w:num w:numId="5">
+  <w:num w:numId="5" w16cid:durableId="1673794511">
     <w:abstractNumId w:val="4"/>
   </w:num>
 </w:numbering>
 </file>
 
 <file path=word/styles.xml><?xml version="1.0" encoding="utf-8"?>
-<w:styles xmlns:mc="http://schemas.openxmlformats.org/markup-compatibility/2006" xmlns:r="http://schemas.openxmlformats.org/officeDocument/2006/relationships" xmlns:w="http://schemas.openxmlformats.org/wordprocessingml/2006/main" xmlns:w14="http://schemas.microsoft.com/office/word/2010/wordml" xmlns:w15="http://schemas.microsoft.com/office/word/2012/wordml" xmlns:w16se="http://schemas.microsoft.com/office/word/2015/wordml/symex" mc:Ignorable="w14 w15 w16se">
+<w:styles xmlns:mc="http://schemas.openxmlformats.org/markup-compatibility/2006" xmlns:r="http://schemas.openxmlformats.org/officeDocument/2006/relationships" xmlns:w="http://schemas.openxmlformats.org/wordprocessingml/2006/main" xmlns:w14="http://schemas.microsoft.com/office/word/2010/wordml" xmlns:w15="http://schemas.microsoft.com/office/word/2012/wordml" xmlns:w16cex="http://schemas.microsoft.com/office/word/2018/wordml/cex" xmlns:w16cid="http://schemas.microsoft.com/office/word/2016/wordml/cid" xmlns:w16="http://schemas.microsoft.com/office/word/2018/wordml" xmlns:w16du="http://schemas.microsoft.com/office/word/2023/wordml/word16du" xmlns:w16sdtdh="http://schemas.microsoft.com/office/word/2020/wordml/sdtdatahash" xmlns:w16sdtfl="http://schemas.microsoft.com/office/word/2024/wordml/sdtformatlock" xmlns:w16se="http://schemas.microsoft.com/office/word/2015/wordml/symex" mc:Ignorable="w14 w15 w16se w16cid w16 w16cex w16sdtdh w16sdtfl w16du">
   <w:docDefaults>
     <w:rPrDefault>
       <w:rPr>
@@ -3325,7 +4974,7 @@
       </w:pPr>
     </w:pPrDefault>
   </w:docDefaults>
-  <w:latentStyles w:defLockedState="0" w:defUIPriority="99" w:defSemiHidden="0" w:defUnhideWhenUsed="0" w:defQFormat="0" w:count="371">
+  <w:latentStyles w:defLockedState="0" w:defUIPriority="99" w:defSemiHidden="0" w:defUnhideWhenUsed="0" w:defQFormat="0" w:count="376">
     <w:lsdException w:name="Normal" w:uiPriority="0" w:qFormat="1"/>
     <w:lsdException w:name="heading 1" w:uiPriority="9" w:qFormat="1"/>
     <w:lsdException w:name="heading 2" w:semiHidden="1" w:uiPriority="9" w:unhideWhenUsed="1" w:qFormat="1"/>
@@ -3697,6 +5346,11 @@
     <w:lsdException w:name="List Table 5 Dark Accent 6" w:uiPriority="50"/>
     <w:lsdException w:name="List Table 6 Colorful Accent 6" w:uiPriority="51"/>
     <w:lsdException w:name="List Table 7 Colorful Accent 6" w:uiPriority="52"/>
+    <w:lsdException w:name="Mention" w:semiHidden="1" w:unhideWhenUsed="1"/>
+    <w:lsdException w:name="Smart Hyperlink" w:semiHidden="1" w:unhideWhenUsed="1"/>
+    <w:lsdException w:name="Hashtag" w:semiHidden="1" w:unhideWhenUsed="1"/>
+    <w:lsdException w:name="Unresolved Mention" w:semiHidden="1" w:unhideWhenUsed="1"/>
+    <w:lsdException w:name="Smart Link" w:semiHidden="1" w:unhideWhenUsed="1"/>
   </w:latentStyles>
   <w:style w:type="paragraph" w:default="1" w:styleId="Normal">
     <w:name w:val="Normal"/>
@@ -3705,6 +5359,27 @@
     <w:pPr>
       <w:spacing w:line="256" w:lineRule="auto"/>
     </w:pPr>
+  </w:style>
+  <w:style w:type="paragraph" w:styleId="Heading1">
+    <w:name w:val="heading 1"/>
+    <w:basedOn w:val="Normal"/>
+    <w:next w:val="Normal"/>
+    <w:link w:val="Heading1Char"/>
+    <w:uiPriority w:val="9"/>
+    <w:qFormat/>
+    <w:rsid w:val="00C20F2D"/>
+    <w:pPr>
+      <w:keepNext/>
+      <w:keepLines/>
+      <w:spacing w:before="240" w:after="0"/>
+      <w:outlineLvl w:val="0"/>
+    </w:pPr>
+    <w:rPr>
+      <w:rFonts w:asciiTheme="majorHAnsi" w:eastAsiaTheme="majorEastAsia" w:hAnsiTheme="majorHAnsi" w:cstheme="majorBidi"/>
+      <w:color w:val="2E74B5" w:themeColor="accent1" w:themeShade="BF"/>
+      <w:sz w:val="32"/>
+      <w:szCs w:val="32"/>
+    </w:rPr>
   </w:style>
   <w:style w:type="paragraph" w:styleId="Heading3">
     <w:name w:val="heading 3"/>
@@ -3728,7 +5403,6 @@
   <w:style w:type="character" w:default="1" w:styleId="DefaultParagraphFont">
     <w:name w:val="Default Paragraph Font"/>
     <w:uiPriority w:val="1"/>
-    <w:semiHidden/>
     <w:unhideWhenUsed/>
   </w:style>
   <w:style w:type="table" w:default="1" w:styleId="TableNormal">
@@ -3888,6 +5562,19 @@
     <w:rPr>
       <w:b/>
       <w:bCs/>
+    </w:rPr>
+  </w:style>
+  <w:style w:type="character" w:customStyle="1" w:styleId="Heading1Char">
+    <w:name w:val="Heading 1 Char"/>
+    <w:basedOn w:val="DefaultParagraphFont"/>
+    <w:link w:val="Heading1"/>
+    <w:uiPriority w:val="9"/>
+    <w:rsid w:val="00C20F2D"/>
+    <w:rPr>
+      <w:rFonts w:asciiTheme="majorHAnsi" w:eastAsiaTheme="majorEastAsia" w:hAnsiTheme="majorHAnsi" w:cstheme="majorBidi"/>
+      <w:color w:val="2E74B5" w:themeColor="accent1" w:themeShade="BF"/>
+      <w:sz w:val="32"/>
+      <w:szCs w:val="32"/>
     </w:rPr>
   </w:style>
 </w:styles>

</xml_diff>